<commit_message>
docs: explain rationale for parameters and functions
</commit_message>
<xml_diff>
--- a/exports/word/Cópia de Projeto_Prorrogacao_Excepcional_Aceita_v1.docx
+++ b/exports/word/Cópia de Projeto_Prorrogacao_Excepcional_Aceita_v1.docx
@@ -2,16 +2,30 @@
 <file path=word/document.xml><?xml version="1.0" encoding="utf-8"?>
 <w:document xmlns:w="http://schemas.openxmlformats.org/wordprocessingml/2006/main" xmlns:m="http://schemas.openxmlformats.org/officeDocument/2006/math" xmlns:r="http://schemas.openxmlformats.org/officeDocument/2006/relationships" xmlns:o="urn:schemas-microsoft-com:office:office" xmlns:v="urn:schemas-microsoft-com:vml" xmlns:w10="urn:schemas-microsoft-com:office:word" xmlns:a="http://schemas.openxmlformats.org/drawingml/2006/main" xmlns:pic="http://schemas.openxmlformats.org/drawingml/2006/picture" xmlns:wp="http://schemas.openxmlformats.org/drawingml/2006/wordprocessingDrawing">
   <w:body>
+    <w:bookmarkStart w:id="26" w:name="X6afc8a15ddbf7aff4476773eaa6898cbb17527e"/>
+    <w:p>
+      <w:pPr>
+        <w:pStyle w:val="Heading1"/>
+      </w:pPr>
+      <w:r>
+        <w:t xml:space="preserve">EFEITO DO CANABIDIOL SOBRE ESTRESSE E MEMÓRIA AVERSIVA APÓS ESTRESSE AGUDO E INTENSO EM ZEBRAFISH</w:t>
+      </w:r>
+    </w:p>
+    <w:bookmarkStart w:id="9" w:name="Xbfe8f0287b7994ec0446859a42ad9528cfc5d32"/>
+    <w:p>
+      <w:pPr>
+        <w:pStyle w:val="Heading2"/>
+      </w:pPr>
+      <w:r>
+        <w:t xml:space="preserve">Proposta de prorrogação excepcional (submetida e aceita)</w:t>
+      </w:r>
+    </w:p>
     <w:p>
       <w:pPr>
         <w:pStyle w:val="FirstParagraph"/>
       </w:pPr>
       <w:r>
-        <w:rPr>
-          <w:b/>
-          <w:bCs/>
-        </w:rPr>
-        <w:t xml:space="preserve">EFEITO DO CANABIDIOL SOBRE ESTRESSE E MEMÓRIA AVERSIVA APÓS ESTRESSE AGUDO E INTENSO EM ZEBRAFISH</w:t>
+        <w:t xml:space="preserve">Projeto de Iniciação Científica em graduação em</w:t>
       </w:r>
     </w:p>
     <w:p>
@@ -19,11 +33,7 @@
         <w:pStyle w:val="BodyText"/>
       </w:pPr>
       <w:r>
-        <w:rPr>
-          <w:b/>
-          <w:bCs/>
-        </w:rPr>
-        <w:t xml:space="preserve">PROPOSTA DE PRORROGAÇÃO EXCEPCIONAL (SUBMETIDA E ACEITA)</w:t>
+        <w:t xml:space="preserve">Medicina da Universidade Estadual Paulista do</w:t>
       </w:r>
     </w:p>
     <w:p>
@@ -31,7 +41,7 @@
         <w:pStyle w:val="BodyText"/>
       </w:pPr>
       <w:r>
-        <w:t xml:space="preserve">Projeto de Iniciação Científica em graduação em</w:t>
+        <w:t xml:space="preserve">campus de Botucatu – FMB/UNESP</w:t>
       </w:r>
     </w:p>
     <w:p>
@@ -39,7 +49,17 @@
         <w:pStyle w:val="BodyText"/>
       </w:pPr>
       <w:r>
-        <w:t xml:space="preserve">Medicina da Universidade Estadual Paulista do</w:t>
+        <w:rPr>
+          <w:b/>
+          <w:bCs/>
+        </w:rPr>
+        <w:t xml:space="preserve">Bolsista:</w:t>
+      </w:r>
+      <w:r>
+        <w:t xml:space="preserve"> </w:t>
+      </w:r>
+      <w:r>
+        <w:t xml:space="preserve">Marco Antônio Sant’ Ana Camargos</w:t>
       </w:r>
     </w:p>
     <w:p>
@@ -47,7 +67,17 @@
         <w:pStyle w:val="BodyText"/>
       </w:pPr>
       <w:r>
-        <w:t xml:space="preserve">campus de Botucatu – FMB/UNESP</w:t>
+        <w:rPr>
+          <w:b/>
+          <w:bCs/>
+        </w:rPr>
+        <w:t xml:space="preserve">Orientadora:</w:t>
+      </w:r>
+      <w:r>
+        <w:t xml:space="preserve"> </w:t>
+      </w:r>
+      <w:r>
+        <w:t xml:space="preserve">Profª. Drª. Percília Cardoso Giaquinto</w:t>
       </w:r>
     </w:p>
     <w:p>
@@ -59,13 +89,13 @@
           <w:b/>
           <w:bCs/>
         </w:rPr>
-        <w:t xml:space="preserve">Bolsista:</w:t>
-      </w:r>
-      <w:r>
-        <w:t xml:space="preserve"> </w:t>
-      </w:r>
-      <w:r>
-        <w:t xml:space="preserve">Marco Antônio Sant’ Ana Camargos</w:t>
+        <w:t xml:space="preserve">Processo:</w:t>
+      </w:r>
+      <w:r>
+        <w:t xml:space="preserve"> </w:t>
+      </w:r>
+      <w:r>
+        <w:t xml:space="preserve">2023/14200-3</w:t>
       </w:r>
     </w:p>
     <w:p>
@@ -77,13 +107,13 @@
           <w:b/>
           <w:bCs/>
         </w:rPr>
-        <w:t xml:space="preserve">Orientadora:</w:t>
-      </w:r>
-      <w:r>
-        <w:t xml:space="preserve"> </w:t>
-      </w:r>
-      <w:r>
-        <w:t xml:space="preserve">Profª. Drª. Percília Cardoso Giaquinto</w:t>
+        <w:t xml:space="preserve">Vigência original da bolsa:</w:t>
+      </w:r>
+      <w:r>
+        <w:t xml:space="preserve"> </w:t>
+      </w:r>
+      <w:r>
+        <w:t xml:space="preserve">01/03/2024 à 28/02/2026 (24 meses)</w:t>
       </w:r>
     </w:p>
     <w:p>
@@ -95,13 +125,13 @@
           <w:b/>
           <w:bCs/>
         </w:rPr>
-        <w:t xml:space="preserve">Processo:</w:t>
-      </w:r>
-      <w:r>
-        <w:t xml:space="preserve"> </w:t>
-      </w:r>
-      <w:r>
-        <w:t xml:space="preserve">2023/14200-3</w:t>
+        <w:t xml:space="preserve">Período de prorrogação excepcional (aceito):</w:t>
+      </w:r>
+      <w:r>
+        <w:t xml:space="preserve"> </w:t>
+      </w:r>
+      <w:r>
+        <w:t xml:space="preserve">01/03/2026 à 28/02/2027 (12 meses)</w:t>
       </w:r>
     </w:p>
     <w:p>
@@ -109,17 +139,7 @@
         <w:pStyle w:val="BodyText"/>
       </w:pPr>
       <w:r>
-        <w:rPr>
-          <w:b/>
-          <w:bCs/>
-        </w:rPr>
-        <w:t xml:space="preserve">Vigência original da bolsa:</w:t>
-      </w:r>
-      <w:r>
-        <w:t xml:space="preserve"> </w:t>
-      </w:r>
-      <w:r>
-        <w:t xml:space="preserve">01/03/2024 à 28/02/2026 (24 meses)</w:t>
+        <w:t xml:space="preserve">Botucatu, São Paulo</w:t>
       </w:r>
     </w:p>
     <w:p>
@@ -127,17 +147,7 @@
         <w:pStyle w:val="BodyText"/>
       </w:pPr>
       <w:r>
-        <w:rPr>
-          <w:b/>
-          <w:bCs/>
-        </w:rPr>
-        <w:t xml:space="preserve">Período de prorrogação excepcional (aceito):</w:t>
-      </w:r>
-      <w:r>
-        <w:t xml:space="preserve"> </w:t>
-      </w:r>
-      <w:r>
-        <w:t xml:space="preserve">01/03/2026 à 28/02/2027 (12 meses)</w:t>
+        <w:t xml:space="preserve">2026</w:t>
       </w:r>
     </w:p>
     <w:p>
@@ -145,28 +155,14 @@
         <w:pStyle w:val="BodyText"/>
       </w:pPr>
       <w:r>
-        <w:t xml:space="preserve">Botucatu, São Paulo</w:t>
-      </w:r>
-    </w:p>
-    <w:p>
-      <w:pPr>
-        <w:pStyle w:val="BodyText"/>
-      </w:pPr>
-      <w:r>
-        <w:t xml:space="preserve">2026</w:t>
-      </w:r>
-    </w:p>
-    <w:p>
-      <w:pPr>
-        <w:pStyle w:val="BodyText"/>
-      </w:pPr>
-      <w:r>
         <w:t xml:space="preserve">Processo FAPESP nº 2023/14200-3</w:t>
       </w:r>
     </w:p>
-    <w:p>
-      <w:pPr>
-        <w:pStyle w:val="BodyText"/>
+    <w:bookmarkEnd w:id="9"/>
+    <w:bookmarkStart w:id="10" w:name="sumário"/>
+    <w:p>
+      <w:pPr>
+        <w:pStyle w:val="Heading2"/>
       </w:pPr>
       <w:r>
         <w:t xml:space="preserve">Sumário</w:t>
@@ -281,7 +277,8 @@
         </w:pict>
       </w:r>
     </w:p>
-    <w:bookmarkStart w:id="9" w:name="X10625ccd1236eaa3c4adc66518977f268921e1e"/>
+    <w:bookmarkEnd w:id="10"/>
+    <w:bookmarkStart w:id="11" w:name="X10625ccd1236eaa3c4adc66518977f268921e1e"/>
     <w:p>
       <w:pPr>
         <w:pStyle w:val="Heading2"/>
@@ -470,91 +467,52 @@
           <w:b/>
           <w:bCs/>
         </w:rPr>
-        <w:t xml:space="preserve">Esclarecimento (alinhamento com o estado atual do software):</w:t>
-      </w:r>
-      <w:r>
-        <w:t xml:space="preserve"> </w:t>
-      </w:r>
-      <w:r>
-        <w:t xml:space="preserve">ao longo do período regular,</w:t>
-      </w:r>
-      <w:r>
-        <w:t xml:space="preserve"> </w:t>
-      </w:r>
-      <w:r>
-        <w:t xml:space="preserve">foram implementadas e consolidadas melhorias que inicialmente eram tratadas como “mudanças”</w:t>
-      </w:r>
-      <w:r>
-        <w:t xml:space="preserve"> </w:t>
-      </w:r>
-      <w:r>
-        <w:t xml:space="preserve">de escopo (ex.: automação de partes do fluxo, melhorias de interface e módulos de processamento).</w:t>
-      </w:r>
-      <w:r>
-        <w:t xml:space="preserve"> </w:t>
-      </w:r>
-      <w:r>
-        <w:t xml:space="preserve">Assim, a</w:t>
-      </w:r>
-      <w:r>
-        <w:t xml:space="preserve"> </w:t>
-      </w:r>
-      <w:r>
-        <w:rPr>
-          <w:b/>
-          <w:bCs/>
-        </w:rPr>
-        <w:t xml:space="preserve">prorrogação excepcional</w:t>
-      </w:r>
-      <w:r>
-        <w:t xml:space="preserve"> </w:t>
-      </w:r>
-      <w:r>
-        <w:t xml:space="preserve">não se justifica por “iniciar uma GUI” ou “criar do zero”</w:t>
-      </w:r>
-      <w:r>
-        <w:t xml:space="preserve"> </w:t>
-      </w:r>
-      <w:r>
-        <w:t xml:space="preserve">automações já existentes, mas por concluir o ciclo de excelência:</w:t>
-      </w:r>
-      <w:r>
-        <w:t xml:space="preserve"> </w:t>
-      </w:r>
-      <w:r>
-        <w:rPr>
-          <w:b/>
-          <w:bCs/>
-        </w:rPr>
-        <w:t xml:space="preserve">empacotamento/ distribuição</w:t>
-      </w:r>
-      <w:r>
-        <w:rPr>
-          <w:b/>
-          <w:bCs/>
-        </w:rPr>
-        <w:t xml:space="preserve"> </w:t>
-      </w:r>
-      <w:r>
-        <w:rPr>
-          <w:b/>
-          <w:bCs/>
-        </w:rPr>
-        <w:t xml:space="preserve">para terceiros</w:t>
-      </w:r>
-      <w:r>
-        <w:t xml:space="preserve">, documentação voltada ao público-alvo, validações rigorosas (incluindo cruzadas)</w:t>
-      </w:r>
-      <w:r>
-        <w:t xml:space="preserve"> </w:t>
-      </w:r>
-      <w:r>
-        <w:t xml:space="preserve">e módulos etológicos avançados.</w:t>
-      </w:r>
-    </w:p>
-    <w:p>
-      <w:pPr>
-        <w:pStyle w:val="Compact"/>
+        <w:t xml:space="preserve">Explicação em linguagem simples (para avaliadores/leitores não técnicos): por que “funções” e</w:t>
+      </w:r>
+      <w:r>
+        <w:rPr>
+          <w:b/>
+          <w:bCs/>
+        </w:rPr>
+        <w:t xml:space="preserve"> </w:t>
+      </w:r>
+      <w:r>
+        <w:rPr>
+          <w:b/>
+          <w:bCs/>
+        </w:rPr>
+        <w:t xml:space="preserve">parâmetros expostos importam</w:t>
+      </w:r>
+    </w:p>
+    <w:p>
+      <w:pPr>
+        <w:pStyle w:val="BodyText"/>
+      </w:pPr>
+      <w:r>
+        <w:t xml:space="preserve">O ZebTrack-AI não é apenas um “programa que encontra o peixe”: ele funciona como um</w:t>
+      </w:r>
+      <w:r>
+        <w:t xml:space="preserve"> </w:t>
+      </w:r>
+      <w:r>
+        <w:rPr>
+          <w:b/>
+          <w:bCs/>
+        </w:rPr>
+        <w:t xml:space="preserve">instrumento de medição do comportamento</w:t>
+      </w:r>
+      <w:r>
+        <w:t xml:space="preserve">. Para que um instrumento seja publicável e utilizável</w:t>
+      </w:r>
+      <w:r>
+        <w:t xml:space="preserve"> </w:t>
+      </w:r>
+      <w:r>
+        <w:t xml:space="preserve">por outros laboratórios, duas coisas são indispensáveis:</w:t>
+      </w:r>
+    </w:p>
+    <w:p>
+      <w:pPr>
         <w:numPr>
           <w:ilvl w:val="0"/>
           <w:numId w:val="1002"/>
@@ -565,30 +523,32 @@
           <w:b/>
           <w:bCs/>
         </w:rPr>
-        <w:t xml:space="preserve">Identificação individual persistente</w:t>
-      </w:r>
-      <w:r>
-        <w:t xml:space="preserve"> </w:t>
-      </w:r>
-      <w:r>
-        <w:t xml:space="preserve">dos animais ao longo do tempo, para rastreio confiável de</w:t>
-      </w:r>
-      <w:r>
-        <w:t xml:space="preserve"> </w:t>
-      </w:r>
-      <w:r>
-        <w:t xml:space="preserve">indivíduos (não apenas “detecção por quadro”), essencial para estudos longitudinais e para</w:t>
-      </w:r>
-      <w:r>
-        <w:t xml:space="preserve"> </w:t>
-      </w:r>
-      <w:r>
-        <w:t xml:space="preserve">análise de variabilidade intraindividual.</w:t>
-      </w:r>
-    </w:p>
-    <w:p>
-      <w:pPr>
-        <w:pStyle w:val="Compact"/>
+        <w:t xml:space="preserve">Procedimentos padronizados (funções/módulos)</w:t>
+      </w:r>
+      <w:r>
+        <w:t xml:space="preserve">: transformar etapas repetidas do método em</w:t>
+      </w:r>
+      <w:r>
+        <w:t xml:space="preserve"> </w:t>
+      </w:r>
+      <w:r>
+        <w:t xml:space="preserve">rotinas consistentes (captura do vídeo → rastreio → detecção de eventos → logs → exportações).</w:t>
+      </w:r>
+      <w:r>
+        <w:t xml:space="preserve"> </w:t>
+      </w:r>
+      <w:r>
+        <w:t xml:space="preserve">Isso reduz erro humano e garante que o mesmo protocolo digital seja aplicado em diferentes dias,</w:t>
+      </w:r>
+      <w:r>
+        <w:t xml:space="preserve"> </w:t>
+      </w:r>
+      <w:r>
+        <w:t xml:space="preserve">animais e operadores.</w:t>
+      </w:r>
+    </w:p>
+    <w:p>
+      <w:pPr>
         <w:numPr>
           <w:ilvl w:val="0"/>
           <w:numId w:val="1002"/>
@@ -599,62 +559,60 @@
           <w:b/>
           <w:bCs/>
         </w:rPr>
-        <w:t xml:space="preserve">Métricas de interação social e comportamento gregário</w:t>
-      </w:r>
-      <w:r>
-        <w:t xml:space="preserve">, fundamentais para ampliar a</w:t>
-      </w:r>
-      <w:r>
-        <w:t xml:space="preserve"> </w:t>
-      </w:r>
-      <w:r>
-        <w:t xml:space="preserve">relevância etológica do sistema (cohesion, distância interindividual, liderança/seguimento,</w:t>
-      </w:r>
-      <w:r>
-        <w:t xml:space="preserve"> </w:t>
-      </w:r>
-      <w:r>
-        <w:t xml:space="preserve">alinhamento, aproximações/evitações), tornando o software capaz de responder a perguntas</w:t>
-      </w:r>
-      <w:r>
-        <w:t xml:space="preserve"> </w:t>
-      </w:r>
-      <w:r>
-        <w:t xml:space="preserve">científicas mais sofisticadas.</w:t>
-      </w:r>
-    </w:p>
-    <w:p>
-      <w:pPr>
-        <w:pStyle w:val="Compact"/>
-        <w:numPr>
-          <w:ilvl w:val="0"/>
-          <w:numId w:val="1002"/>
-        </w:numPr>
-      </w:pPr>
-      <w:r>
-        <w:rPr>
-          <w:b/>
-          <w:bCs/>
-        </w:rPr>
-        <w:t xml:space="preserve">Ampliação do software para o período noturno</w:t>
-      </w:r>
-      <w:r>
-        <w:t xml:space="preserve"> </w:t>
-      </w:r>
-      <w:r>
-        <w:t xml:space="preserve">(baixa luminosidade), permitindo investigar</w:t>
-      </w:r>
-      <w:r>
-        <w:t xml:space="preserve"> </w:t>
-      </w:r>
-      <w:r>
-        <w:t xml:space="preserve">alterações comportamentais e etos em condições de escuro/penumbra, com impacto direto na</w:t>
-      </w:r>
-      <w:r>
-        <w:t xml:space="preserve"> </w:t>
-      </w:r>
-      <w:r>
-        <w:t xml:space="preserve">interpretação de efeitos farmacológicos e de estressores sobre o ciclo de atividade.</w:t>
+        <w:t xml:space="preserve">Parâmetros de controle visíveis e registrados</w:t>
+      </w:r>
+      <w:r>
+        <w:t xml:space="preserve">: a IA tem “ajustes” que mudam sua sensibilidade</w:t>
+      </w:r>
+      <w:r>
+        <w:t xml:space="preserve"> </w:t>
+      </w:r>
+      <w:r>
+        <w:t xml:space="preserve">(por exemplo, o quão rigorosa ela é para aceitar uma detecção). Em comportamento, pequenos erros</w:t>
+      </w:r>
+      <w:r>
+        <w:t xml:space="preserve"> </w:t>
+      </w:r>
+      <w:r>
+        <w:t xml:space="preserve">de rastreio podem parecer efeito do tratamento (ex.: aumentar ou reduzir artificialmente velocidade,</w:t>
+      </w:r>
+      <w:r>
+        <w:t xml:space="preserve"> </w:t>
+      </w:r>
+      <w:r>
+        <w:t xml:space="preserve">tempo parado/</w:t>
+      </w:r>
+      <w:r>
+        <w:rPr>
+          <w:i/>
+          <w:iCs/>
+        </w:rPr>
+        <w:t xml:space="preserve">freezing</w:t>
+      </w:r>
+      <w:r>
+        <w:t xml:space="preserve"> </w:t>
+      </w:r>
+      <w:r>
+        <w:t xml:space="preserve">ou tempo em zonas). Ao expor parâmetros na interface e salvar os valores</w:t>
+      </w:r>
+      <w:r>
+        <w:t xml:space="preserve"> </w:t>
+      </w:r>
+      <w:r>
+        <w:t xml:space="preserve">usados, o método fica</w:t>
+      </w:r>
+      <w:r>
+        <w:t xml:space="preserve"> </w:t>
+      </w:r>
+      <w:r>
+        <w:rPr>
+          <w:b/>
+          <w:bCs/>
+        </w:rPr>
+        <w:t xml:space="preserve">transparente, auditável e reprodutível</w:t>
+      </w:r>
+      <w:r>
+        <w:t xml:space="preserve">.</w:t>
       </w:r>
     </w:p>
     <w:p>
@@ -662,89 +620,19 @@
         <w:pStyle w:val="FirstParagraph"/>
       </w:pPr>
       <w:r>
-        <w:t xml:space="preserve">Essas frentes se conectam diretamente ao objetivo de produzir um</w:t>
-      </w:r>
-      <w:r>
-        <w:t xml:space="preserve"> </w:t>
-      </w:r>
-      <w:r>
-        <w:rPr>
-          <w:b/>
-          <w:bCs/>
-        </w:rPr>
-        <w:t xml:space="preserve">artigo técnico-científico</w:t>
-      </w:r>
-      <w:r>
-        <w:rPr>
-          <w:b/>
-          <w:bCs/>
-        </w:rPr>
-        <w:t xml:space="preserve"> </w:t>
-      </w:r>
-      <w:r>
-        <w:rPr>
-          <w:b/>
-          <w:bCs/>
-        </w:rPr>
-        <w:t xml:space="preserve">robusto sobre o software</w:t>
-      </w:r>
-      <w:r>
-        <w:t xml:space="preserve"> </w:t>
-      </w:r>
-      <w:r>
-        <w:t xml:space="preserve">(metodologia, validação, desempenho, replicabilidade, limitações e</w:t>
-      </w:r>
-      <w:r>
-        <w:t xml:space="preserve"> </w:t>
-      </w:r>
-      <w:r>
-        <w:t xml:space="preserve">casos de uso), e não apenas um relato de “ferramenta auxiliar” do projeto.</w:t>
-      </w:r>
-    </w:p>
-    <w:p>
-      <w:r>
-        <w:pict>
-          <v:rect style="width:0;height:1.5pt" o:hralign="center" o:hrstd="t" o:hr="t"/>
-        </w:pict>
-      </w:r>
-    </w:p>
-    <w:bookmarkEnd w:id="9"/>
-    <w:bookmarkStart w:id="12" w:name="Xf7140d085ef971f686602a6848796bf9290d5a4"/>
-    <w:p>
-      <w:pPr>
-        <w:pStyle w:val="Heading2"/>
-      </w:pPr>
-      <w:r>
-        <w:t xml:space="preserve">2. Justificativas técnico-científicas e de mérito</w:t>
-      </w:r>
-    </w:p>
-    <w:bookmarkStart w:id="10" w:name="Xdd388a5a2ccb328dd3a58dd78fa6ca5e3ccaf93"/>
-    <w:p>
-      <w:pPr>
-        <w:pStyle w:val="Heading3"/>
-      </w:pPr>
-      <w:r>
-        <w:t xml:space="preserve">2.1 Por que a prorrogação excepcional é essencial para atingir excelência</w:t>
-      </w:r>
-    </w:p>
-    <w:p>
-      <w:pPr>
-        <w:pStyle w:val="FirstParagraph"/>
-      </w:pPr>
-      <w:r>
-        <w:t xml:space="preserve">O projeto evoluiu de um pipeline de rastreio orientado a uma pergunta experimental específica</w:t>
-      </w:r>
-      <w:r>
-        <w:t xml:space="preserve"> </w:t>
-      </w:r>
-      <w:r>
-        <w:t xml:space="preserve">(CBD e estresse) para uma plataforma de análise comportamental baseada em IA com potencial</w:t>
-      </w:r>
-      <w:r>
-        <w:t xml:space="preserve"> </w:t>
-      </w:r>
-      <w:r>
-        <w:t xml:space="preserve">reutilizável, auditável e ampliável para múltiplas linhas do laboratório.</w:t>
+        <w:t xml:space="preserve">Isso se conecta diretamente ao zebrafish: é um modelo altamente sensível a luz, reflexos, ondulação</w:t>
+      </w:r>
+      <w:r>
+        <w:t xml:space="preserve"> </w:t>
+      </w:r>
+      <w:r>
+        <w:t xml:space="preserve">e condições ambientais. Sem controle fino e registro dos parâmetros, resultados podem variar por</w:t>
+      </w:r>
+      <w:r>
+        <w:t xml:space="preserve"> </w:t>
+      </w:r>
+      <w:r>
+        <w:t xml:space="preserve">“condições do vídeo”, e não por fenômenos neurocomportamentais reais.</w:t>
       </w:r>
     </w:p>
     <w:p>
@@ -752,19 +640,90 @@
         <w:pStyle w:val="BodyText"/>
       </w:pPr>
       <w:r>
-        <w:t xml:space="preserve">A prorrogação excepcional é essencial porque, para que o ZebTrack-AI alcance excelência e</w:t>
-      </w:r>
-      <w:r>
-        <w:t xml:space="preserve"> </w:t>
-      </w:r>
-      <w:r>
-        <w:t xml:space="preserve">utilidade real para a comunidade, é necessário concluir um ciclo completo de engenharia e</w:t>
-      </w:r>
-      <w:r>
-        <w:t xml:space="preserve"> </w:t>
-      </w:r>
-      <w:r>
-        <w:t xml:space="preserve">validação científica que inclua:</w:t>
+        <w:rPr>
+          <w:b/>
+          <w:bCs/>
+        </w:rPr>
+        <w:t xml:space="preserve">Esclarecimento (alinhamento com o estado atual do software):</w:t>
+      </w:r>
+      <w:r>
+        <w:t xml:space="preserve"> </w:t>
+      </w:r>
+      <w:r>
+        <w:t xml:space="preserve">ao longo do período regular,</w:t>
+      </w:r>
+      <w:r>
+        <w:t xml:space="preserve"> </w:t>
+      </w:r>
+      <w:r>
+        <w:t xml:space="preserve">foram implementadas e consolidadas melhorias que inicialmente eram tratadas como “mudanças”</w:t>
+      </w:r>
+      <w:r>
+        <w:t xml:space="preserve"> </w:t>
+      </w:r>
+      <w:r>
+        <w:t xml:space="preserve">de escopo (ex.: automação de partes do fluxo, melhorias de interface e módulos de processamento).</w:t>
+      </w:r>
+      <w:r>
+        <w:t xml:space="preserve"> </w:t>
+      </w:r>
+      <w:r>
+        <w:t xml:space="preserve">Assim, a</w:t>
+      </w:r>
+      <w:r>
+        <w:t xml:space="preserve"> </w:t>
+      </w:r>
+      <w:r>
+        <w:rPr>
+          <w:b/>
+          <w:bCs/>
+        </w:rPr>
+        <w:t xml:space="preserve">prorrogação excepcional</w:t>
+      </w:r>
+      <w:r>
+        <w:t xml:space="preserve"> </w:t>
+      </w:r>
+      <w:r>
+        <w:t xml:space="preserve">não se justifica por “iniciar uma GUI” ou “criar do zero”</w:t>
+      </w:r>
+      <w:r>
+        <w:t xml:space="preserve"> </w:t>
+      </w:r>
+      <w:r>
+        <w:t xml:space="preserve">automações já existentes, mas por concluir o ciclo de excelência:</w:t>
+      </w:r>
+      <w:r>
+        <w:t xml:space="preserve"> </w:t>
+      </w:r>
+      <w:r>
+        <w:rPr>
+          <w:b/>
+          <w:bCs/>
+        </w:rPr>
+        <w:t xml:space="preserve">empacotamento/ distribuição</w:t>
+      </w:r>
+      <w:r>
+        <w:rPr>
+          <w:b/>
+          <w:bCs/>
+        </w:rPr>
+        <w:t xml:space="preserve"> </w:t>
+      </w:r>
+      <w:r>
+        <w:rPr>
+          <w:b/>
+          <w:bCs/>
+        </w:rPr>
+        <w:t xml:space="preserve">para terceiros</w:t>
+      </w:r>
+      <w:r>
+        <w:t xml:space="preserve">, documentação voltada ao público-alvo, validações rigorosas (incluindo cruzadas)</w:t>
+      </w:r>
+      <w:r>
+        <w:t xml:space="preserve"> </w:t>
+      </w:r>
+      <w:r>
+        <w:t xml:space="preserve">e módulos etológicos avançados.</w:t>
       </w:r>
     </w:p>
     <w:p>
@@ -780,25 +739,25 @@
           <w:b/>
           <w:bCs/>
         </w:rPr>
-        <w:t xml:space="preserve">Funções avançadas que surgiram durante o desenvolvimento</w:t>
-      </w:r>
-      <w:r>
-        <w:t xml:space="preserve"> </w:t>
-      </w:r>
-      <w:r>
-        <w:t xml:space="preserve">(identidade individual,</w:t>
-      </w:r>
-      <w:r>
-        <w:t xml:space="preserve"> </w:t>
-      </w:r>
-      <w:r>
-        <w:t xml:space="preserve">interação social/gregarismo e módulo noturno), tornando o sistema apto a responder a</w:t>
-      </w:r>
-      <w:r>
-        <w:t xml:space="preserve"> </w:t>
-      </w:r>
-      <w:r>
-        <w:t xml:space="preserve">perguntas etológicas mais exigentes.</w:t>
+        <w:t xml:space="preserve">Identificação individual persistente</w:t>
+      </w:r>
+      <w:r>
+        <w:t xml:space="preserve"> </w:t>
+      </w:r>
+      <w:r>
+        <w:t xml:space="preserve">dos animais ao longo do tempo, para rastreio confiável de</w:t>
+      </w:r>
+      <w:r>
+        <w:t xml:space="preserve"> </w:t>
+      </w:r>
+      <w:r>
+        <w:t xml:space="preserve">indivíduos (não apenas “detecção por quadro”), essencial para estudos longitudinais e para</w:t>
+      </w:r>
+      <w:r>
+        <w:t xml:space="preserve"> </w:t>
+      </w:r>
+      <w:r>
+        <w:t xml:space="preserve">análise de variabilidade intraindividual.</w:t>
       </w:r>
     </w:p>
     <w:p>
@@ -814,22 +773,28 @@
           <w:b/>
           <w:bCs/>
         </w:rPr>
-        <w:t xml:space="preserve">Validação rigorosa com múltiplos pesquisadores do grupo</w:t>
-      </w:r>
-      <w:r>
-        <w:t xml:space="preserve">, incluindo testes cruzados</w:t>
-      </w:r>
-      <w:r>
-        <w:t xml:space="preserve"> </w:t>
-      </w:r>
-      <w:r>
-        <w:t xml:space="preserve">(diferentes aparatos, diferentes rotinas de gravação, diferentes operadores) para garantir</w:t>
-      </w:r>
-      <w:r>
-        <w:t xml:space="preserve"> </w:t>
-      </w:r>
-      <w:r>
-        <w:t xml:space="preserve">replicabilidade.</w:t>
+        <w:t xml:space="preserve">Métricas de interação social e comportamento gregário</w:t>
+      </w:r>
+      <w:r>
+        <w:t xml:space="preserve">, fundamentais para ampliar a</w:t>
+      </w:r>
+      <w:r>
+        <w:t xml:space="preserve"> </w:t>
+      </w:r>
+      <w:r>
+        <w:t xml:space="preserve">relevância etológica do sistema (cohesion, distância interindividual, liderança/seguimento,</w:t>
+      </w:r>
+      <w:r>
+        <w:t xml:space="preserve"> </w:t>
+      </w:r>
+      <w:r>
+        <w:t xml:space="preserve">alinhamento, aproximações/evitações), tornando o software capaz de responder a perguntas</w:t>
+      </w:r>
+      <w:r>
+        <w:t xml:space="preserve"> </w:t>
+      </w:r>
+      <w:r>
+        <w:t xml:space="preserve">científicas mais sofisticadas.</w:t>
       </w:r>
     </w:p>
     <w:p>
@@ -845,59 +810,25 @@
           <w:b/>
           <w:bCs/>
         </w:rPr>
-        <w:t xml:space="preserve">Padronização de protocolos e documentação</w:t>
-      </w:r>
-      <w:r>
-        <w:t xml:space="preserve"> </w:t>
-      </w:r>
-      <w:r>
-        <w:t xml:space="preserve">(configuração, aquisição de dados,</w:t>
-      </w:r>
-      <w:r>
-        <w:t xml:space="preserve"> </w:t>
-      </w:r>
-      <w:r>
-        <w:t xml:space="preserve">armazenamento, parâmetros, exportação e análise), condição necessária para publicação</w:t>
-      </w:r>
-      <w:r>
-        <w:t xml:space="preserve"> </w:t>
-      </w:r>
-      <w:r>
-        <w:t xml:space="preserve">adequada do software como método.</w:t>
-      </w:r>
-    </w:p>
-    <w:p>
-      <w:pPr>
-        <w:pStyle w:val="Compact"/>
-        <w:numPr>
-          <w:ilvl w:val="0"/>
-          <w:numId w:val="1003"/>
-        </w:numPr>
-      </w:pPr>
-      <w:r>
-        <w:rPr>
-          <w:b/>
-          <w:bCs/>
-        </w:rPr>
-        <w:t xml:space="preserve">Integração de desempenho e robustez</w:t>
-      </w:r>
-      <w:r>
-        <w:t xml:space="preserve"> </w:t>
-      </w:r>
-      <w:r>
-        <w:t xml:space="preserve">(velocidade, estabilidade, controle de qualidade dos</w:t>
-      </w:r>
-      <w:r>
-        <w:t xml:space="preserve"> </w:t>
-      </w:r>
-      <w:r>
-        <w:t xml:space="preserve">dados, tratamento de casos difíceis), requisito para que o software seja confiável em estudos</w:t>
-      </w:r>
-      <w:r>
-        <w:t xml:space="preserve"> </w:t>
-      </w:r>
-      <w:r>
-        <w:t xml:space="preserve">com grandes n e com protocolos longos.</w:t>
+        <w:t xml:space="preserve">Ampliação do software para o período noturno</w:t>
+      </w:r>
+      <w:r>
+        <w:t xml:space="preserve"> </w:t>
+      </w:r>
+      <w:r>
+        <w:t xml:space="preserve">(baixa luminosidade), permitindo investigar</w:t>
+      </w:r>
+      <w:r>
+        <w:t xml:space="preserve"> </w:t>
+      </w:r>
+      <w:r>
+        <w:t xml:space="preserve">alterações comportamentais e etos em condições de escuro/penumbra, com impacto direto na</w:t>
+      </w:r>
+      <w:r>
+        <w:t xml:space="preserve"> </w:t>
+      </w:r>
+      <w:r>
+        <w:t xml:space="preserve">interpretação de efeitos farmacológicos e de estressores sobre o ciclo de atividade.</w:t>
       </w:r>
     </w:p>
     <w:p>
@@ -905,91 +836,89 @@
         <w:pStyle w:val="FirstParagraph"/>
       </w:pPr>
       <w:r>
-        <w:t xml:space="preserve">Além disso, surgiu recentemente uma oportunidade técnica relevante: no início deste ano foi</w:t>
-      </w:r>
-      <w:r>
-        <w:t xml:space="preserve"> </w:t>
-      </w:r>
-      <w:r>
-        <w:t xml:space="preserve">publicado o</w:t>
-      </w:r>
-      <w:r>
-        <w:t xml:space="preserve"> </w:t>
-      </w:r>
-      <w:r>
-        <w:rPr>
-          <w:b/>
-          <w:bCs/>
-        </w:rPr>
-        <w:t xml:space="preserve">YOLOv26</w:t>
-      </w:r>
-      <w:r>
-        <w:t xml:space="preserve">. Isso se alinha diretamente ao objetivo de</w:t>
-      </w:r>
-      <w:r>
-        <w:t xml:space="preserve"> </w:t>
-      </w:r>
-      <w:r>
-        <w:rPr>
-          <w:b/>
-          <w:bCs/>
-        </w:rPr>
-        <w:t xml:space="preserve">acessibilidade</w:t>
-      </w:r>
-      <w:r>
-        <w:t xml:space="preserve"> </w:t>
-      </w:r>
-      <w:r>
-        <w:t xml:space="preserve">do</w:t>
-      </w:r>
-      <w:r>
-        <w:t xml:space="preserve"> </w:t>
-      </w:r>
-      <w:r>
-        <w:t xml:space="preserve">ZebTrack-AI, pois pode viabilizar que o pesquisador rode o pipeline com maior eficiência em</w:t>
-      </w:r>
-      <w:r>
-        <w:t xml:space="preserve"> </w:t>
-      </w:r>
-      <w:r>
-        <w:t xml:space="preserve">seu</w:t>
-      </w:r>
-      <w:r>
-        <w:t xml:space="preserve"> </w:t>
-      </w:r>
-      <w:r>
-        <w:rPr>
-          <w:b/>
-          <w:bCs/>
-        </w:rPr>
-        <w:t xml:space="preserve">próprio computador</w:t>
-      </w:r>
-      <w:r>
-        <w:t xml:space="preserve">, reduzindo a necessidade de placas gráficas dedicadas e de alto</w:t>
-      </w:r>
-      <w:r>
-        <w:t xml:space="preserve"> </w:t>
-      </w:r>
-      <w:r>
-        <w:t xml:space="preserve">custo (ex.: GPUs NVIDIA ou Intel e/ou soluções específicas pouco disponíveis no contexto de pesquisa no</w:t>
-      </w:r>
-      <w:r>
-        <w:t xml:space="preserve"> </w:t>
-      </w:r>
-      <w:r>
-        <w:t xml:space="preserve">Brasil). Em um cenário de recursos limitados para aquisição de hardware, essa evolução é</w:t>
-      </w:r>
-      <w:r>
-        <w:t xml:space="preserve"> </w:t>
-      </w:r>
-      <w:r>
-        <w:t xml:space="preserve">essencial para ampliar o número de pesquisadores que poderão utilizar a ferramenta e para</w:t>
-      </w:r>
-      <w:r>
-        <w:t xml:space="preserve"> </w:t>
-      </w:r>
-      <w:r>
-        <w:t xml:space="preserve">diminuir o tempo exigido em processamento/iterações.</w:t>
+        <w:t xml:space="preserve">Essas frentes se conectam diretamente ao objetivo de produzir um</w:t>
+      </w:r>
+      <w:r>
+        <w:t xml:space="preserve"> </w:t>
+      </w:r>
+      <w:r>
+        <w:rPr>
+          <w:b/>
+          <w:bCs/>
+        </w:rPr>
+        <w:t xml:space="preserve">artigo técnico-científico</w:t>
+      </w:r>
+      <w:r>
+        <w:rPr>
+          <w:b/>
+          <w:bCs/>
+        </w:rPr>
+        <w:t xml:space="preserve"> </w:t>
+      </w:r>
+      <w:r>
+        <w:rPr>
+          <w:b/>
+          <w:bCs/>
+        </w:rPr>
+        <w:t xml:space="preserve">robusto sobre o software</w:t>
+      </w:r>
+      <w:r>
+        <w:t xml:space="preserve"> </w:t>
+      </w:r>
+      <w:r>
+        <w:t xml:space="preserve">(metodologia, validação, desempenho, replicabilidade, limitações e</w:t>
+      </w:r>
+      <w:r>
+        <w:t xml:space="preserve"> </w:t>
+      </w:r>
+      <w:r>
+        <w:t xml:space="preserve">casos de uso), e não apenas um relato de “ferramenta auxiliar” do projeto.</w:t>
+      </w:r>
+    </w:p>
+    <w:p>
+      <w:r>
+        <w:pict>
+          <v:rect style="width:0;height:1.5pt" o:hralign="center" o:hrstd="t" o:hr="t"/>
+        </w:pict>
+      </w:r>
+    </w:p>
+    <w:bookmarkEnd w:id="11"/>
+    <w:bookmarkStart w:id="14" w:name="Xf7140d085ef971f686602a6848796bf9290d5a4"/>
+    <w:p>
+      <w:pPr>
+        <w:pStyle w:val="Heading2"/>
+      </w:pPr>
+      <w:r>
+        <w:t xml:space="preserve">2. Justificativas técnico-científicas e de mérito</w:t>
+      </w:r>
+    </w:p>
+    <w:bookmarkStart w:id="12" w:name="Xdd388a5a2ccb328dd3a58dd78fa6ca5e3ccaf93"/>
+    <w:p>
+      <w:pPr>
+        <w:pStyle w:val="Heading3"/>
+      </w:pPr>
+      <w:r>
+        <w:t xml:space="preserve">2.1 Por que a prorrogação excepcional é essencial para atingir excelência</w:t>
+      </w:r>
+    </w:p>
+    <w:p>
+      <w:pPr>
+        <w:pStyle w:val="FirstParagraph"/>
+      </w:pPr>
+      <w:r>
+        <w:t xml:space="preserve">O projeto evoluiu de um pipeline de rastreio orientado a uma pergunta experimental específica</w:t>
+      </w:r>
+      <w:r>
+        <w:t xml:space="preserve"> </w:t>
+      </w:r>
+      <w:r>
+        <w:t xml:space="preserve">(CBD e estresse) para uma plataforma de análise comportamental baseada em IA com potencial</w:t>
+      </w:r>
+      <w:r>
+        <w:t xml:space="preserve"> </w:t>
+      </w:r>
+      <w:r>
+        <w:t xml:space="preserve">reutilizável, auditável e ampliável para múltiplas linhas do laboratório.</w:t>
       </w:r>
     </w:p>
     <w:p>
@@ -997,45 +926,19 @@
         <w:pStyle w:val="BodyText"/>
       </w:pPr>
       <w:r>
-        <w:t xml:space="preserve">Em síntese, a prorrogação não é apenas “tempo adicional”, mas a condição necessária para</w:t>
-      </w:r>
-      <w:r>
-        <w:t xml:space="preserve"> </w:t>
-      </w:r>
-      <w:r>
-        <w:t xml:space="preserve">concluir o software como produto científico validado, elevando a qualidade dos resultados</w:t>
-      </w:r>
-      <w:r>
-        <w:t xml:space="preserve"> </w:t>
-      </w:r>
-      <w:r>
-        <w:t xml:space="preserve">comportamentais e o alcance do investimento já realizado.</w:t>
-      </w:r>
-    </w:p>
-    <w:p>
-      <w:pPr>
-        <w:pStyle w:val="BodyText"/>
-      </w:pPr>
-      <w:r>
-        <w:rPr>
-          <w:b/>
-          <w:bCs/>
-        </w:rPr>
-        <w:t xml:space="preserve">Evidência de avanço mensurável e a relação com recursos computacionais pagos:</w:t>
-      </w:r>
-    </w:p>
-    <w:p>
-      <w:pPr>
-        <w:pStyle w:val="BodyText"/>
-      </w:pPr>
-      <w:r>
-        <w:t xml:space="preserve">No período de desenvolvimento, o desempenho do modelo de detecção de zebrafish evoluiu de</w:t>
-      </w:r>
-      <w:r>
-        <w:t xml:space="preserve"> </w:t>
-      </w:r>
-      <w:r>
-        <w:t xml:space="preserve">forma mensurável na validação (Roboflow), por exemplo ao comparar versões recentes:</w:t>
+        <w:t xml:space="preserve">A prorrogação excepcional é essencial porque, para que o ZebTrack-AI alcance excelência e</w:t>
+      </w:r>
+      <w:r>
+        <w:t xml:space="preserve"> </w:t>
+      </w:r>
+      <w:r>
+        <w:t xml:space="preserve">utilidade real para a comunidade, é necessário concluir um ciclo completo de engenharia e</w:t>
+      </w:r>
+      <w:r>
+        <w:t xml:space="preserve"> </w:t>
+      </w:r>
+      <w:r>
+        <w:t xml:space="preserve">validação científica que inclua:</w:t>
       </w:r>
     </w:p>
     <w:p>
@@ -1051,13 +954,25 @@
           <w:b/>
           <w:bCs/>
         </w:rPr>
-        <w:t xml:space="preserve">ZebraFish Detection 14:</w:t>
-      </w:r>
-      <w:r>
-        <w:t xml:space="preserve"> </w:t>
-      </w:r>
-      <w:r>
-        <w:t xml:space="preserve">mAP@50 90,2%; Precisão 91,6%; Recall 86,6%.</w:t>
+        <w:t xml:space="preserve">Funções avançadas que surgiram durante o desenvolvimento</w:t>
+      </w:r>
+      <w:r>
+        <w:t xml:space="preserve"> </w:t>
+      </w:r>
+      <w:r>
+        <w:t xml:space="preserve">(identidade individual,</w:t>
+      </w:r>
+      <w:r>
+        <w:t xml:space="preserve"> </w:t>
+      </w:r>
+      <w:r>
+        <w:t xml:space="preserve">interação social/gregarismo e módulo noturno), tornando o sistema apto a responder a</w:t>
+      </w:r>
+      <w:r>
+        <w:t xml:space="preserve"> </w:t>
+      </w:r>
+      <w:r>
+        <w:t xml:space="preserve">perguntas etológicas mais exigentes.</w:t>
       </w:r>
     </w:p>
     <w:p>
@@ -1073,13 +988,90 @@
           <w:b/>
           <w:bCs/>
         </w:rPr>
-        <w:t xml:space="preserve">ZebraFish Detection 15 (YOLOv11, v15):</w:t>
-      </w:r>
-      <w:r>
-        <w:t xml:space="preserve"> </w:t>
-      </w:r>
-      <w:r>
-        <w:t xml:space="preserve">mAP@50 96,5%; Precisão 96,4%; Recall 94,1%.</w:t>
+        <w:t xml:space="preserve">Validação rigorosa com múltiplos pesquisadores do grupo</w:t>
+      </w:r>
+      <w:r>
+        <w:t xml:space="preserve">, incluindo testes cruzados</w:t>
+      </w:r>
+      <w:r>
+        <w:t xml:space="preserve"> </w:t>
+      </w:r>
+      <w:r>
+        <w:t xml:space="preserve">(diferentes aparatos, diferentes rotinas de gravação, diferentes operadores) para garantir</w:t>
+      </w:r>
+      <w:r>
+        <w:t xml:space="preserve"> </w:t>
+      </w:r>
+      <w:r>
+        <w:t xml:space="preserve">replicabilidade.</w:t>
+      </w:r>
+    </w:p>
+    <w:p>
+      <w:pPr>
+        <w:pStyle w:val="Compact"/>
+        <w:numPr>
+          <w:ilvl w:val="0"/>
+          <w:numId w:val="1004"/>
+        </w:numPr>
+      </w:pPr>
+      <w:r>
+        <w:rPr>
+          <w:b/>
+          <w:bCs/>
+        </w:rPr>
+        <w:t xml:space="preserve">Padronização de protocolos e documentação</w:t>
+      </w:r>
+      <w:r>
+        <w:t xml:space="preserve"> </w:t>
+      </w:r>
+      <w:r>
+        <w:t xml:space="preserve">(configuração, aquisição de dados,</w:t>
+      </w:r>
+      <w:r>
+        <w:t xml:space="preserve"> </w:t>
+      </w:r>
+      <w:r>
+        <w:t xml:space="preserve">armazenamento, parâmetros, exportação e análise), condição necessária para publicação</w:t>
+      </w:r>
+      <w:r>
+        <w:t xml:space="preserve"> </w:t>
+      </w:r>
+      <w:r>
+        <w:t xml:space="preserve">adequada do software como método.</w:t>
+      </w:r>
+    </w:p>
+    <w:p>
+      <w:pPr>
+        <w:pStyle w:val="Compact"/>
+        <w:numPr>
+          <w:ilvl w:val="0"/>
+          <w:numId w:val="1004"/>
+        </w:numPr>
+      </w:pPr>
+      <w:r>
+        <w:rPr>
+          <w:b/>
+          <w:bCs/>
+        </w:rPr>
+        <w:t xml:space="preserve">Integração de desempenho e robustez</w:t>
+      </w:r>
+      <w:r>
+        <w:t xml:space="preserve"> </w:t>
+      </w:r>
+      <w:r>
+        <w:t xml:space="preserve">(velocidade, estabilidade, controle de qualidade dos</w:t>
+      </w:r>
+      <w:r>
+        <w:t xml:space="preserve"> </w:t>
+      </w:r>
+      <w:r>
+        <w:t xml:space="preserve">dados, tratamento de casos difíceis), requisito para que o software seja confiável em estudos</w:t>
+      </w:r>
+      <w:r>
+        <w:t xml:space="preserve"> </w:t>
+      </w:r>
+      <w:r>
+        <w:t xml:space="preserve">com grandes n e com protocolos longos.</w:t>
       </w:r>
     </w:p>
     <w:p>
@@ -1087,67 +1079,91 @@
         <w:pStyle w:val="FirstParagraph"/>
       </w:pPr>
       <w:r>
-        <w:t xml:space="preserve">Isso corresponde a ganhos de</w:t>
-      </w:r>
-      <w:r>
-        <w:t xml:space="preserve"> </w:t>
-      </w:r>
-      <w:r>
-        <w:rPr>
-          <w:b/>
-          <w:bCs/>
-        </w:rPr>
-        <w:t xml:space="preserve">+6,3 p.p.</w:t>
-      </w:r>
-      <w:r>
-        <w:t xml:space="preserve"> </w:t>
-      </w:r>
-      <w:r>
-        <w:t xml:space="preserve">(mAP@50),</w:t>
-      </w:r>
-      <w:r>
-        <w:t xml:space="preserve"> </w:t>
-      </w:r>
-      <w:r>
-        <w:rPr>
-          <w:b/>
-          <w:bCs/>
-        </w:rPr>
-        <w:t xml:space="preserve">+4,8 p.p.</w:t>
-      </w:r>
-      <w:r>
-        <w:t xml:space="preserve"> </w:t>
-      </w:r>
-      <w:r>
-        <w:t xml:space="preserve">(Precisão) e</w:t>
-      </w:r>
-      <w:r>
-        <w:t xml:space="preserve"> </w:t>
-      </w:r>
-      <w:r>
-        <w:rPr>
-          <w:b/>
-          <w:bCs/>
-        </w:rPr>
-        <w:t xml:space="preserve">+7,5 p.p.</w:t>
-      </w:r>
-      <w:r>
-        <w:t xml:space="preserve"> </w:t>
-      </w:r>
-      <w:r>
-        <w:t xml:space="preserve">(Recall), com impacto direto na confiabilidade do rastreio (menos perdas e menos falsos</w:t>
-      </w:r>
-      <w:r>
-        <w:t xml:space="preserve"> </w:t>
-      </w:r>
-      <w:r>
-        <w:t xml:space="preserve">eventos), o que é decisivo quando o sistema é parte do método experimental (detecção → evento</w:t>
-      </w:r>
-      <w:r>
-        <w:t xml:space="preserve"> </w:t>
-      </w:r>
-      <w:r>
-        <w:t xml:space="preserve">→ estímulo → logs).</w:t>
+        <w:t xml:space="preserve">Além disso, surgiu recentemente uma oportunidade técnica relevante: no início deste ano foi</w:t>
+      </w:r>
+      <w:r>
+        <w:t xml:space="preserve"> </w:t>
+      </w:r>
+      <w:r>
+        <w:t xml:space="preserve">publicado o</w:t>
+      </w:r>
+      <w:r>
+        <w:t xml:space="preserve"> </w:t>
+      </w:r>
+      <w:r>
+        <w:rPr>
+          <w:b/>
+          <w:bCs/>
+        </w:rPr>
+        <w:t xml:space="preserve">YOLOv26</w:t>
+      </w:r>
+      <w:r>
+        <w:t xml:space="preserve">. Isso se alinha diretamente ao objetivo de</w:t>
+      </w:r>
+      <w:r>
+        <w:t xml:space="preserve"> </w:t>
+      </w:r>
+      <w:r>
+        <w:rPr>
+          <w:b/>
+          <w:bCs/>
+        </w:rPr>
+        <w:t xml:space="preserve">acessibilidade</w:t>
+      </w:r>
+      <w:r>
+        <w:t xml:space="preserve"> </w:t>
+      </w:r>
+      <w:r>
+        <w:t xml:space="preserve">do</w:t>
+      </w:r>
+      <w:r>
+        <w:t xml:space="preserve"> </w:t>
+      </w:r>
+      <w:r>
+        <w:t xml:space="preserve">ZebTrack-AI, pois pode viabilizar que o pesquisador rode o pipeline com maior eficiência em</w:t>
+      </w:r>
+      <w:r>
+        <w:t xml:space="preserve"> </w:t>
+      </w:r>
+      <w:r>
+        <w:t xml:space="preserve">seu</w:t>
+      </w:r>
+      <w:r>
+        <w:t xml:space="preserve"> </w:t>
+      </w:r>
+      <w:r>
+        <w:rPr>
+          <w:b/>
+          <w:bCs/>
+        </w:rPr>
+        <w:t xml:space="preserve">próprio computador</w:t>
+      </w:r>
+      <w:r>
+        <w:t xml:space="preserve">, reduzindo a necessidade de placas gráficas dedicadas e de alto</w:t>
+      </w:r>
+      <w:r>
+        <w:t xml:space="preserve"> </w:t>
+      </w:r>
+      <w:r>
+        <w:t xml:space="preserve">custo (ex.: GPUs NVIDIA ou Intel e/ou soluções específicas pouco disponíveis no contexto de pesquisa no</w:t>
+      </w:r>
+      <w:r>
+        <w:t xml:space="preserve"> </w:t>
+      </w:r>
+      <w:r>
+        <w:t xml:space="preserve">Brasil). Em um cenário de recursos limitados para aquisição de hardware, essa evolução é</w:t>
+      </w:r>
+      <w:r>
+        <w:t xml:space="preserve"> </w:t>
+      </w:r>
+      <w:r>
+        <w:t xml:space="preserve">essencial para ampliar o número de pesquisadores que poderão utilizar a ferramenta e para</w:t>
+      </w:r>
+      <w:r>
+        <w:t xml:space="preserve"> </w:t>
+      </w:r>
+      <w:r>
+        <w:t xml:space="preserve">diminuir o tempo exigido em processamento/iterações.</w:t>
       </w:r>
     </w:p>
     <w:p>
@@ -1155,61 +1171,19 @@
         <w:pStyle w:val="BodyText"/>
       </w:pPr>
       <w:r>
-        <w:t xml:space="preserve">Para alcançar esse patamar, foi necessário sustentar ciclos de melhoria que demandam</w:t>
-      </w:r>
-      <w:r>
-        <w:t xml:space="preserve"> </w:t>
-      </w:r>
-      <w:r>
-        <w:t xml:space="preserve">infraestrutura: expansão e curadoria de dataset em larga escala, treinamento com mais épocas,</w:t>
-      </w:r>
-      <w:r>
-        <w:t xml:space="preserve"> </w:t>
-      </w:r>
-      <w:r>
-        <w:t xml:space="preserve">validação frequente e iteração rápida sobre parâmetros e falhas reais do aparato (reflexos,</w:t>
-      </w:r>
-      <w:r>
-        <w:t xml:space="preserve"> </w:t>
-      </w:r>
-      <w:r>
-        <w:t xml:space="preserve">ondulações, baixa luz, oclusões). Nesse contexto,</w:t>
-      </w:r>
-      <w:r>
-        <w:t xml:space="preserve"> </w:t>
-      </w:r>
-      <w:r>
-        <w:rPr>
-          <w:b/>
-          <w:bCs/>
-        </w:rPr>
-        <w:t xml:space="preserve">assinaturas, créditos e unidades</w:t>
-      </w:r>
-      <w:r>
-        <w:rPr>
-          <w:b/>
-          <w:bCs/>
-        </w:rPr>
-        <w:t xml:space="preserve"> </w:t>
-      </w:r>
-      <w:r>
-        <w:rPr>
-          <w:b/>
-          <w:bCs/>
-        </w:rPr>
-        <w:t xml:space="preserve">computacionais</w:t>
-      </w:r>
-      <w:r>
-        <w:t xml:space="preserve"> </w:t>
-      </w:r>
-      <w:r>
-        <w:t xml:space="preserve">(p.ex., nuvem para treino e ferramentas de produtividade para desenvolvimento)</w:t>
-      </w:r>
-      <w:r>
-        <w:t xml:space="preserve"> </w:t>
-      </w:r>
-      <w:r>
-        <w:t xml:space="preserve">foram essenciais para manter um ritmo de iteração compatível com o cronograma do projeto.</w:t>
+        <w:t xml:space="preserve">Em síntese, a prorrogação não é apenas “tempo adicional”, mas a condição necessária para</w:t>
+      </w:r>
+      <w:r>
+        <w:t xml:space="preserve"> </w:t>
+      </w:r>
+      <w:r>
+        <w:t xml:space="preserve">concluir o software como produto científico validado, elevando a qualidade dos resultados</w:t>
+      </w:r>
+      <w:r>
+        <w:t xml:space="preserve"> </w:t>
+      </w:r>
+      <w:r>
+        <w:t xml:space="preserve">comportamentais e o alcance do investimento já realizado.</w:t>
       </w:r>
     </w:p>
     <w:p>
@@ -1217,64 +1191,25 @@
         <w:pStyle w:val="BodyText"/>
       </w:pPr>
       <w:r>
-        <w:t xml:space="preserve">Esse ponto é ainda mais relevante considerando a realidade de um bolsista no</w:t>
-      </w:r>
-      <w:r>
-        <w:t xml:space="preserve"> </w:t>
-      </w:r>
-      <w:r>
-        <w:rPr>
-          <w:b/>
-          <w:bCs/>
-        </w:rPr>
-        <w:t xml:space="preserve">4º ano de</w:t>
-      </w:r>
-      <w:r>
-        <w:rPr>
-          <w:b/>
-          <w:bCs/>
-        </w:rPr>
-        <w:t xml:space="preserve"> </w:t>
-      </w:r>
-      <w:r>
-        <w:rPr>
-          <w:b/>
-          <w:bCs/>
-        </w:rPr>
-        <w:t xml:space="preserve">Medicina</w:t>
-      </w:r>
-      <w:r>
-        <w:t xml:space="preserve">, com carga acadêmica intensa: sem esses recursos, o custo em tempo de treinamento,</w:t>
-      </w:r>
-      <w:r>
-        <w:t xml:space="preserve"> </w:t>
-      </w:r>
-      <w:r>
-        <w:t xml:space="preserve">debug e reprocessamento tornaria inviável a maturação do software no nível de excelência</w:t>
-      </w:r>
-      <w:r>
-        <w:t xml:space="preserve"> </w:t>
-      </w:r>
-      <w:r>
-        <w:t xml:space="preserve">necessário para publicação apropriada e adoção por outros pesquisadores.</w:t>
-      </w:r>
-    </w:p>
-    <w:bookmarkEnd w:id="10"/>
-    <w:bookmarkStart w:id="11" w:name="X8422dc6f657e1cd3717e475a47d3dfffdbba33f"/>
-    <w:p>
-      <w:pPr>
-        <w:pStyle w:val="Heading3"/>
-      </w:pPr>
-      <w:r>
-        <w:t xml:space="preserve">2.2 Por que a não concessão inviabilizaria resultados no nível de excelência esperado</w:t>
-      </w:r>
-    </w:p>
-    <w:p>
-      <w:pPr>
-        <w:pStyle w:val="FirstParagraph"/>
-      </w:pPr>
-      <w:r>
-        <w:t xml:space="preserve">A não continuidade do período prorrogado comprometeria de forma direta e prática:</w:t>
+        <w:rPr>
+          <w:b/>
+          <w:bCs/>
+        </w:rPr>
+        <w:t xml:space="preserve">Evidência de avanço mensurável e a relação com recursos computacionais pagos:</w:t>
+      </w:r>
+    </w:p>
+    <w:p>
+      <w:pPr>
+        <w:pStyle w:val="BodyText"/>
+      </w:pPr>
+      <w:r>
+        <w:t xml:space="preserve">No período de desenvolvimento, o desempenho do modelo de detecção de zebrafish evoluiu de</w:t>
+      </w:r>
+      <w:r>
+        <w:t xml:space="preserve"> </w:t>
+      </w:r>
+      <w:r>
+        <w:t xml:space="preserve">forma mensurável na validação (Roboflow), por exemplo ao comparar versões recentes:</w:t>
       </w:r>
     </w:p>
     <w:p>
@@ -1290,28 +1225,13 @@
           <w:b/>
           <w:bCs/>
         </w:rPr>
-        <w:t xml:space="preserve">A publicação apropriada de um artigo sobre o software</w:t>
-      </w:r>
-      <w:r>
-        <w:t xml:space="preserve">: sem tempo para implementar e</w:t>
-      </w:r>
-      <w:r>
-        <w:t xml:space="preserve"> </w:t>
-      </w:r>
-      <w:r>
-        <w:t xml:space="preserve">validar as funções de alto impacto (ID individual, interação social e módulo noturno), o artigo</w:t>
-      </w:r>
-      <w:r>
-        <w:t xml:space="preserve"> </w:t>
-      </w:r>
-      <w:r>
-        <w:t xml:space="preserve">ficaria limitado a uma descrição parcial do pipeline, com menor relevância e menor capacidade</w:t>
-      </w:r>
-      <w:r>
-        <w:t xml:space="preserve"> </w:t>
-      </w:r>
-      <w:r>
-        <w:t xml:space="preserve">de generalização.</w:t>
+        <w:t xml:space="preserve">ZebraFish Detection 14:</w:t>
+      </w:r>
+      <w:r>
+        <w:t xml:space="preserve"> </w:t>
+      </w:r>
+      <w:r>
+        <w:t xml:space="preserve">mAP@50 90,2%; Precisão 91,6%; Recall 86,6%.</w:t>
       </w:r>
     </w:p>
     <w:p>
@@ -1327,59 +1247,13 @@
           <w:b/>
           <w:bCs/>
         </w:rPr>
-        <w:t xml:space="preserve">A excelência na análise etológica</w:t>
-      </w:r>
-      <w:r>
-        <w:t xml:space="preserve">: o zebrafish é um modelo com forte componente social e</w:t>
-      </w:r>
-      <w:r>
-        <w:t xml:space="preserve"> </w:t>
-      </w:r>
-      <w:r>
-        <w:t xml:space="preserve">com comportamento dependente de condições ambientais e de ciclo claro/escuro. Sem essas</w:t>
-      </w:r>
-      <w:r>
-        <w:t xml:space="preserve"> </w:t>
-      </w:r>
-      <w:r>
-        <w:t xml:space="preserve">extensões, o software fica restrito a análises menos completas, reduzindo o valor científico do</w:t>
-      </w:r>
-      <w:r>
-        <w:t xml:space="preserve"> </w:t>
-      </w:r>
-      <w:r>
-        <w:t xml:space="preserve">sistema.</w:t>
-      </w:r>
-    </w:p>
-    <w:p>
-      <w:pPr>
-        <w:pStyle w:val="Compact"/>
-        <w:numPr>
-          <w:ilvl w:val="0"/>
-          <w:numId w:val="1005"/>
-        </w:numPr>
-      </w:pPr>
-      <w:r>
-        <w:rPr>
-          <w:b/>
-          <w:bCs/>
-        </w:rPr>
-        <w:t xml:space="preserve">A validação colaborativa e reprodutibilidade</w:t>
-      </w:r>
-      <w:r>
-        <w:t xml:space="preserve">: concluir apenas com validações internas e</w:t>
-      </w:r>
-      <w:r>
-        <w:t xml:space="preserve"> </w:t>
-      </w:r>
-      <w:r>
-        <w:t xml:space="preserve">pontuais limita a confiança nos dados e impede que colegas do grupo adotem a plataforma em</w:t>
-      </w:r>
-      <w:r>
-        <w:t xml:space="preserve"> </w:t>
-      </w:r>
-      <w:r>
-        <w:t xml:space="preserve">projetos paralelos, reduzindo o impacto institucional do desenvolvimento.</w:t>
+        <w:t xml:space="preserve">ZebraFish Detection 15 (YOLOv11, v15):</w:t>
+      </w:r>
+      <w:r>
+        <w:t xml:space="preserve"> </w:t>
+      </w:r>
+      <w:r>
+        <w:t xml:space="preserve">mAP@50 96,5%; Precisão 96,4%; Recall 94,1%.</w:t>
       </w:r>
     </w:p>
     <w:p>
@@ -1387,46 +1261,186 @@
         <w:pStyle w:val="FirstParagraph"/>
       </w:pPr>
       <w:r>
-        <w:t xml:space="preserve">Assim, a prorrogação excepcional é indispensável para evitar que um avanço metodológico</w:t>
-      </w:r>
-      <w:r>
-        <w:t xml:space="preserve"> </w:t>
-      </w:r>
-      <w:r>
-        <w:t xml:space="preserve">substantivo se encerre prematuramente, impedindo o pleno aproveitamento da inovação</w:t>
-      </w:r>
-      <w:r>
-        <w:t xml:space="preserve"> </w:t>
-      </w:r>
-      <w:r>
-        <w:t xml:space="preserve">construída.</w:t>
-      </w:r>
-    </w:p>
-    <w:p>
-      <w:r>
-        <w:pict>
-          <v:rect style="width:0;height:1.5pt" o:hralign="center" o:hrstd="t" o:hr="t"/>
-        </w:pict>
-      </w:r>
-    </w:p>
-    <w:bookmarkEnd w:id="11"/>
+        <w:t xml:space="preserve">Isso corresponde a ganhos de</w:t>
+      </w:r>
+      <w:r>
+        <w:t xml:space="preserve"> </w:t>
+      </w:r>
+      <w:r>
+        <w:rPr>
+          <w:b/>
+          <w:bCs/>
+        </w:rPr>
+        <w:t xml:space="preserve">+6,3 p.p.</w:t>
+      </w:r>
+      <w:r>
+        <w:t xml:space="preserve"> </w:t>
+      </w:r>
+      <w:r>
+        <w:t xml:space="preserve">(mAP@50),</w:t>
+      </w:r>
+      <w:r>
+        <w:t xml:space="preserve"> </w:t>
+      </w:r>
+      <w:r>
+        <w:rPr>
+          <w:b/>
+          <w:bCs/>
+        </w:rPr>
+        <w:t xml:space="preserve">+4,8 p.p.</w:t>
+      </w:r>
+      <w:r>
+        <w:t xml:space="preserve"> </w:t>
+      </w:r>
+      <w:r>
+        <w:t xml:space="preserve">(Precisão) e</w:t>
+      </w:r>
+      <w:r>
+        <w:t xml:space="preserve"> </w:t>
+      </w:r>
+      <w:r>
+        <w:rPr>
+          <w:b/>
+          <w:bCs/>
+        </w:rPr>
+        <w:t xml:space="preserve">+7,5 p.p.</w:t>
+      </w:r>
+      <w:r>
+        <w:t xml:space="preserve"> </w:t>
+      </w:r>
+      <w:r>
+        <w:t xml:space="preserve">(Recall), com impacto direto na confiabilidade do rastreio (menos perdas e menos falsos</w:t>
+      </w:r>
+      <w:r>
+        <w:t xml:space="preserve"> </w:t>
+      </w:r>
+      <w:r>
+        <w:t xml:space="preserve">eventos), o que é decisivo quando o sistema é parte do método experimental (detecção → evento</w:t>
+      </w:r>
+      <w:r>
+        <w:t xml:space="preserve"> </w:t>
+      </w:r>
+      <w:r>
+        <w:t xml:space="preserve">→ estímulo → logs).</w:t>
+      </w:r>
+    </w:p>
+    <w:p>
+      <w:pPr>
+        <w:pStyle w:val="BodyText"/>
+      </w:pPr>
+      <w:r>
+        <w:t xml:space="preserve">Para alcançar esse patamar, foi necessário sustentar ciclos de melhoria que demandam</w:t>
+      </w:r>
+      <w:r>
+        <w:t xml:space="preserve"> </w:t>
+      </w:r>
+      <w:r>
+        <w:t xml:space="preserve">infraestrutura: expansão e curadoria de dataset em larga escala, treinamento com mais épocas,</w:t>
+      </w:r>
+      <w:r>
+        <w:t xml:space="preserve"> </w:t>
+      </w:r>
+      <w:r>
+        <w:t xml:space="preserve">validação frequente e iteração rápida sobre parâmetros e falhas reais do aparato (reflexos,</w:t>
+      </w:r>
+      <w:r>
+        <w:t xml:space="preserve"> </w:t>
+      </w:r>
+      <w:r>
+        <w:t xml:space="preserve">ondulações, baixa luz, oclusões). Nesse contexto,</w:t>
+      </w:r>
+      <w:r>
+        <w:t xml:space="preserve"> </w:t>
+      </w:r>
+      <w:r>
+        <w:rPr>
+          <w:b/>
+          <w:bCs/>
+        </w:rPr>
+        <w:t xml:space="preserve">assinaturas, créditos e unidades</w:t>
+      </w:r>
+      <w:r>
+        <w:rPr>
+          <w:b/>
+          <w:bCs/>
+        </w:rPr>
+        <w:t xml:space="preserve"> </w:t>
+      </w:r>
+      <w:r>
+        <w:rPr>
+          <w:b/>
+          <w:bCs/>
+        </w:rPr>
+        <w:t xml:space="preserve">computacionais</w:t>
+      </w:r>
+      <w:r>
+        <w:t xml:space="preserve"> </w:t>
+      </w:r>
+      <w:r>
+        <w:t xml:space="preserve">(p.ex., nuvem para treino e ferramentas de produtividade para desenvolvimento)</w:t>
+      </w:r>
+      <w:r>
+        <w:t xml:space="preserve"> </w:t>
+      </w:r>
+      <w:r>
+        <w:t xml:space="preserve">foram essenciais para manter um ritmo de iteração compatível com o cronograma do projeto.</w:t>
+      </w:r>
+    </w:p>
+    <w:p>
+      <w:pPr>
+        <w:pStyle w:val="BodyText"/>
+      </w:pPr>
+      <w:r>
+        <w:t xml:space="preserve">Esse ponto é ainda mais relevante considerando a realidade de um bolsista no</w:t>
+      </w:r>
+      <w:r>
+        <w:t xml:space="preserve"> </w:t>
+      </w:r>
+      <w:r>
+        <w:rPr>
+          <w:b/>
+          <w:bCs/>
+        </w:rPr>
+        <w:t xml:space="preserve">4º ano de</w:t>
+      </w:r>
+      <w:r>
+        <w:rPr>
+          <w:b/>
+          <w:bCs/>
+        </w:rPr>
+        <w:t xml:space="preserve"> </w:t>
+      </w:r>
+      <w:r>
+        <w:rPr>
+          <w:b/>
+          <w:bCs/>
+        </w:rPr>
+        <w:t xml:space="preserve">Medicina</w:t>
+      </w:r>
+      <w:r>
+        <w:t xml:space="preserve">, com carga acadêmica intensa: sem esses recursos, o custo em tempo de treinamento,</w:t>
+      </w:r>
+      <w:r>
+        <w:t xml:space="preserve"> </w:t>
+      </w:r>
+      <w:r>
+        <w:t xml:space="preserve">debug e reprocessamento tornaria inviável a maturação do software no nível de excelência</w:t>
+      </w:r>
+      <w:r>
+        <w:t xml:space="preserve"> </w:t>
+      </w:r>
+      <w:r>
+        <w:t xml:space="preserve">necessário para publicação apropriada e adoção por outros pesquisadores.</w:t>
+      </w:r>
+    </w:p>
     <w:bookmarkEnd w:id="12"/>
-    <w:bookmarkStart w:id="18" w:name="X6cbe77c84a9e2da2db6764aec60a03cadee2a54"/>
-    <w:p>
-      <w:pPr>
-        <w:pStyle w:val="Heading2"/>
-      </w:pPr>
-      <w:r>
-        <w:t xml:space="preserve">3. Metodologia e plano de execução do período prorrogado</w:t>
-      </w:r>
-    </w:p>
-    <w:bookmarkStart w:id="13" w:name="X32869231436294760c3d1d6b399f20f21960ee9"/>
+    <w:bookmarkStart w:id="13" w:name="X8422dc6f657e1cd3717e475a47d3dfffdbba33f"/>
     <w:p>
       <w:pPr>
         <w:pStyle w:val="Heading3"/>
       </w:pPr>
       <w:r>
-        <w:t xml:space="preserve">3.1 Consolidação e publicação científica do software (ZebTrack-AI)</w:t>
+        <w:t xml:space="preserve">2.2 Por que a não concessão inviabilizaria resultados no nível de excelência esperado</w:t>
       </w:r>
     </w:p>
     <w:p>
@@ -1434,7 +1448,7 @@
         <w:pStyle w:val="FirstParagraph"/>
       </w:pPr>
       <w:r>
-        <w:t xml:space="preserve">No período prorrogado, o software será consolidado como método científico por meio de:</w:t>
+        <w:t xml:space="preserve">A não continuidade do período prorrogado comprometeria de forma direta e prática:</w:t>
       </w:r>
     </w:p>
     <w:p>
@@ -1446,7 +1460,32 @@
         </w:numPr>
       </w:pPr>
       <w:r>
-        <w:t xml:space="preserve">Padronização de entradas/saídas e logs para rastreio e análise (reprodutibilidade e auditoria).</w:t>
+        <w:rPr>
+          <w:b/>
+          <w:bCs/>
+        </w:rPr>
+        <w:t xml:space="preserve">A publicação apropriada de um artigo sobre o software</w:t>
+      </w:r>
+      <w:r>
+        <w:t xml:space="preserve">: sem tempo para implementar e</w:t>
+      </w:r>
+      <w:r>
+        <w:t xml:space="preserve"> </w:t>
+      </w:r>
+      <w:r>
+        <w:t xml:space="preserve">validar as funções de alto impacto (ID individual, interação social e módulo noturno), o artigo</w:t>
+      </w:r>
+      <w:r>
+        <w:t xml:space="preserve"> </w:t>
+      </w:r>
+      <w:r>
+        <w:t xml:space="preserve">ficaria limitado a uma descrição parcial do pipeline, com menor relevância e menor capacidade</w:t>
+      </w:r>
+      <w:r>
+        <w:t xml:space="preserve"> </w:t>
+      </w:r>
+      <w:r>
+        <w:t xml:space="preserve">de generalização.</w:t>
       </w:r>
     </w:p>
     <w:p>
@@ -1458,7 +1497,32 @@
         </w:numPr>
       </w:pPr>
       <w:r>
-        <w:t xml:space="preserve">Organização do fluxo de trabalho (configuração, execução, exportações e relatórios).</w:t>
+        <w:rPr>
+          <w:b/>
+          <w:bCs/>
+        </w:rPr>
+        <w:t xml:space="preserve">A excelência na análise etológica</w:t>
+      </w:r>
+      <w:r>
+        <w:t xml:space="preserve">: o zebrafish é um modelo com forte componente social e</w:t>
+      </w:r>
+      <w:r>
+        <w:t xml:space="preserve"> </w:t>
+      </w:r>
+      <w:r>
+        <w:t xml:space="preserve">com comportamento dependente de condições ambientais e de ciclo claro/escuro. Sem essas</w:t>
+      </w:r>
+      <w:r>
+        <w:t xml:space="preserve"> </w:t>
+      </w:r>
+      <w:r>
+        <w:t xml:space="preserve">extensões, o software fica restrito a análises menos completas, reduzindo o valor científico do</w:t>
+      </w:r>
+      <w:r>
+        <w:t xml:space="preserve"> </w:t>
+      </w:r>
+      <w:r>
+        <w:t xml:space="preserve">sistema.</w:t>
       </w:r>
     </w:p>
     <w:p>
@@ -1470,105 +1534,26 @@
         </w:numPr>
       </w:pPr>
       <w:r>
-        <w:t xml:space="preserve">Definição de critérios mínimos de qualidade dos dados (ex.: métricas de consistência do</w:t>
-      </w:r>
-      <w:r>
-        <w:t xml:space="preserve"> </w:t>
-      </w:r>
-      <w:r>
-        <w:t xml:space="preserve">rastreio, detecção de perdas de trajetória e alertas).</w:t>
-      </w:r>
-    </w:p>
-    <w:p>
-      <w:pPr>
-        <w:pStyle w:val="Compact"/>
-        <w:numPr>
-          <w:ilvl w:val="0"/>
-          <w:numId w:val="1006"/>
-        </w:numPr>
-      </w:pPr>
-      <w:r>
-        <w:t xml:space="preserve">Produção de material para publicação: descrição metodológica, experimentos de validação,</w:t>
-      </w:r>
-      <w:r>
-        <w:t xml:space="preserve"> </w:t>
-      </w:r>
-      <w:r>
-        <w:t xml:space="preserve">análise de limitações e recomendações de uso.</w:t>
-      </w:r>
-    </w:p>
-    <w:p>
-      <w:pPr>
-        <w:pStyle w:val="Compact"/>
-        <w:numPr>
-          <w:ilvl w:val="0"/>
-          <w:numId w:val="1006"/>
-        </w:numPr>
-      </w:pPr>
-      <w:r>
-        <w:t xml:space="preserve">Preparação do software para uso por terceiros no formato “modo laboratório”: empacotamento,</w:t>
-      </w:r>
-      <w:r>
-        <w:t xml:space="preserve"> </w:t>
-      </w:r>
-      <w:r>
-        <w:t xml:space="preserve">distribuição,</w:t>
-      </w:r>
-      <w:r>
-        <w:t xml:space="preserve"> </w:t>
-      </w:r>
-      <w:r>
-        <w:rPr>
-          <w:i/>
-          <w:iCs/>
-        </w:rPr>
-        <w:t xml:space="preserve">presets</w:t>
-      </w:r>
-      <w:r>
-        <w:t xml:space="preserve"> </w:t>
-      </w:r>
-      <w:r>
-        <w:t xml:space="preserve">por protocolo e geração de um</w:t>
-      </w:r>
-      <w:r>
-        <w:t xml:space="preserve"> </w:t>
-      </w:r>
-      <w:r>
-        <w:rPr>
-          <w:i/>
-          <w:iCs/>
-        </w:rPr>
-        <w:t xml:space="preserve">bundle</w:t>
-      </w:r>
-      <w:r>
-        <w:t xml:space="preserve"> </w:t>
-      </w:r>
-      <w:r>
-        <w:t xml:space="preserve">reprodutível (configurações,</w:t>
-      </w:r>
-      <w:r>
-        <w:t xml:space="preserve"> </w:t>
-      </w:r>
-      <w:r>
-        <w:t xml:space="preserve">versões e pesos utilizados) para auditoria e replicação.</w:t>
-      </w:r>
-    </w:p>
-    <w:p>
-      <w:pPr>
-        <w:pStyle w:val="Compact"/>
-        <w:numPr>
-          <w:ilvl w:val="0"/>
-          <w:numId w:val="1006"/>
-        </w:numPr>
-      </w:pPr>
-      <w:r>
-        <w:t xml:space="preserve">Redação de documentação voltada ao público-alvo (pesquisadores e laboratórios), incluindo</w:t>
-      </w:r>
-      <w:r>
-        <w:t xml:space="preserve"> </w:t>
-      </w:r>
-      <w:r>
-        <w:t xml:space="preserve">guias de uso, tutoriais do fluxo (wizard → projeto → relatórios) e recomendações de qualidade.</w:t>
+        <w:rPr>
+          <w:b/>
+          <w:bCs/>
+        </w:rPr>
+        <w:t xml:space="preserve">A validação colaborativa e reprodutibilidade</w:t>
+      </w:r>
+      <w:r>
+        <w:t xml:space="preserve">: concluir apenas com validações internas e</w:t>
+      </w:r>
+      <w:r>
+        <w:t xml:space="preserve"> </w:t>
+      </w:r>
+      <w:r>
+        <w:t xml:space="preserve">pontuais limita a confiança nos dados e impede que colegas do grupo adotem a plataforma em</w:t>
+      </w:r>
+      <w:r>
+        <w:t xml:space="preserve"> </w:t>
+      </w:r>
+      <w:r>
+        <w:t xml:space="preserve">projetos paralelos, reduzindo o impacto institucional do desenvolvimento.</w:t>
       </w:r>
     </w:p>
     <w:p>
@@ -1576,23 +1561,46 @@
         <w:pStyle w:val="FirstParagraph"/>
       </w:pPr>
       <w:r>
-        <w:t xml:space="preserve">O objetivo é permitir um artigo focado no software como ferramenta científica, com resultados de</w:t>
-      </w:r>
-      <w:r>
-        <w:t xml:space="preserve"> </w:t>
-      </w:r>
-      <w:r>
-        <w:t xml:space="preserve">validação e aplicabilidade em etologia e neuropsicofarmacologia.</w:t>
+        <w:t xml:space="preserve">Assim, a prorrogação excepcional é indispensável para evitar que um avanço metodológico</w:t>
+      </w:r>
+      <w:r>
+        <w:t xml:space="preserve"> </w:t>
+      </w:r>
+      <w:r>
+        <w:t xml:space="preserve">substantivo se encerre prematuramente, impedindo o pleno aproveitamento da inovação</w:t>
+      </w:r>
+      <w:r>
+        <w:t xml:space="preserve"> </w:t>
+      </w:r>
+      <w:r>
+        <w:t xml:space="preserve">construída.</w:t>
+      </w:r>
+    </w:p>
+    <w:p>
+      <w:r>
+        <w:pict>
+          <v:rect style="width:0;height:1.5pt" o:hralign="center" o:hrstd="t" o:hr="t"/>
+        </w:pict>
       </w:r>
     </w:p>
     <w:bookmarkEnd w:id="13"/>
-    <w:bookmarkStart w:id="14" w:name="Xce8a6a517cf8917971ee3eabba86a6244db9818"/>
+    <w:bookmarkEnd w:id="14"/>
+    <w:bookmarkStart w:id="21" w:name="X6cbe77c84a9e2da2db6764aec60a03cadee2a54"/>
+    <w:p>
+      <w:pPr>
+        <w:pStyle w:val="Heading2"/>
+      </w:pPr>
+      <w:r>
+        <w:t xml:space="preserve">3. Metodologia e plano de execução do período prorrogado</w:t>
+      </w:r>
+    </w:p>
+    <w:bookmarkStart w:id="16" w:name="X32869231436294760c3d1d6b399f20f21960ee9"/>
     <w:p>
       <w:pPr>
         <w:pStyle w:val="Heading3"/>
       </w:pPr>
       <w:r>
-        <w:t xml:space="preserve">3.2 Identificação individual dos animais (rastreamento longitudinal e persistência de identidade)</w:t>
+        <w:t xml:space="preserve">3.1 Consolidação e publicação científica do software (ZebTrack-AI)</w:t>
       </w:r>
     </w:p>
     <w:p>
@@ -1600,29 +1608,7 @@
         <w:pStyle w:val="FirstParagraph"/>
       </w:pPr>
       <w:r>
-        <w:t xml:space="preserve">Para ampliar a capacidade científica do ZebTrack-AI, será desenvolvida uma camada que permita</w:t>
-      </w:r>
-      <w:r>
-        <w:t xml:space="preserve"> </w:t>
-      </w:r>
-      <w:r>
-        <w:t xml:space="preserve">associar uma</w:t>
-      </w:r>
-      <w:r>
-        <w:t xml:space="preserve"> </w:t>
-      </w:r>
-      <w:r>
-        <w:rPr>
-          <w:b/>
-          <w:bCs/>
-        </w:rPr>
-        <w:t xml:space="preserve">identidade persistente</w:t>
-      </w:r>
-      <w:r>
-        <w:t xml:space="preserve"> </w:t>
-      </w:r>
-      <w:r>
-        <w:t xml:space="preserve">aos animais ao longo do tempo, essencial para:</w:t>
+        <w:t xml:space="preserve">No período prorrogado, o software será consolidado como método científico por meio de:</w:t>
       </w:r>
     </w:p>
     <w:p>
@@ -1634,7 +1620,7 @@
         </w:numPr>
       </w:pPr>
       <w:r>
-        <w:t xml:space="preserve">Estudos longitudinais indivíduo-a-indivíduo.</w:t>
+        <w:t xml:space="preserve">Padronização de entradas/saídas e logs para rastreio e análise (reprodutibilidade e auditoria).</w:t>
       </w:r>
     </w:p>
     <w:p>
@@ -1646,7 +1632,7 @@
         </w:numPr>
       </w:pPr>
       <w:r>
-        <w:t xml:space="preserve">Redução de ambiguidades em cruzamentos, oclusões e aproximações.</w:t>
+        <w:t xml:space="preserve">Organização do fluxo de trabalho (configuração, execução, exportações e relatórios).</w:t>
       </w:r>
     </w:p>
     <w:p>
@@ -1658,13 +1644,105 @@
         </w:numPr>
       </w:pPr>
       <w:r>
-        <w:t xml:space="preserve">Extração de métricas individuais confiáveis (velocidade, freezing, padrões espaciais,</w:t>
-      </w:r>
-      <w:r>
-        <w:t xml:space="preserve"> </w:t>
-      </w:r>
-      <w:r>
-        <w:t xml:space="preserve">preferências, latências, etc.).</w:t>
+        <w:t xml:space="preserve">Definição de critérios mínimos de qualidade dos dados (ex.: métricas de consistência do</w:t>
+      </w:r>
+      <w:r>
+        <w:t xml:space="preserve"> </w:t>
+      </w:r>
+      <w:r>
+        <w:t xml:space="preserve">rastreio, detecção de perdas de trajetória e alertas).</w:t>
+      </w:r>
+    </w:p>
+    <w:p>
+      <w:pPr>
+        <w:pStyle w:val="Compact"/>
+        <w:numPr>
+          <w:ilvl w:val="0"/>
+          <w:numId w:val="1007"/>
+        </w:numPr>
+      </w:pPr>
+      <w:r>
+        <w:t xml:space="preserve">Produção de material para publicação: descrição metodológica, experimentos de validação,</w:t>
+      </w:r>
+      <w:r>
+        <w:t xml:space="preserve"> </w:t>
+      </w:r>
+      <w:r>
+        <w:t xml:space="preserve">análise de limitações e recomendações de uso.</w:t>
+      </w:r>
+    </w:p>
+    <w:p>
+      <w:pPr>
+        <w:pStyle w:val="Compact"/>
+        <w:numPr>
+          <w:ilvl w:val="0"/>
+          <w:numId w:val="1007"/>
+        </w:numPr>
+      </w:pPr>
+      <w:r>
+        <w:t xml:space="preserve">Preparação do software para uso por terceiros no formato “modo laboratório”: empacotamento,</w:t>
+      </w:r>
+      <w:r>
+        <w:t xml:space="preserve"> </w:t>
+      </w:r>
+      <w:r>
+        <w:t xml:space="preserve">distribuição,</w:t>
+      </w:r>
+      <w:r>
+        <w:t xml:space="preserve"> </w:t>
+      </w:r>
+      <w:r>
+        <w:rPr>
+          <w:i/>
+          <w:iCs/>
+        </w:rPr>
+        <w:t xml:space="preserve">presets</w:t>
+      </w:r>
+      <w:r>
+        <w:t xml:space="preserve"> </w:t>
+      </w:r>
+      <w:r>
+        <w:t xml:space="preserve">por protocolo e geração de um</w:t>
+      </w:r>
+      <w:r>
+        <w:t xml:space="preserve"> </w:t>
+      </w:r>
+      <w:r>
+        <w:rPr>
+          <w:i/>
+          <w:iCs/>
+        </w:rPr>
+        <w:t xml:space="preserve">bundle</w:t>
+      </w:r>
+      <w:r>
+        <w:t xml:space="preserve"> </w:t>
+      </w:r>
+      <w:r>
+        <w:t xml:space="preserve">reprodutível (configurações,</w:t>
+      </w:r>
+      <w:r>
+        <w:t xml:space="preserve"> </w:t>
+      </w:r>
+      <w:r>
+        <w:t xml:space="preserve">versões e pesos utilizados) para auditoria e replicação.</w:t>
+      </w:r>
+    </w:p>
+    <w:p>
+      <w:pPr>
+        <w:pStyle w:val="Compact"/>
+        <w:numPr>
+          <w:ilvl w:val="0"/>
+          <w:numId w:val="1007"/>
+        </w:numPr>
+      </w:pPr>
+      <w:r>
+        <w:t xml:space="preserve">Redação de documentação voltada ao público-alvo (pesquisadores e laboratórios), incluindo</w:t>
+      </w:r>
+      <w:r>
+        <w:t xml:space="preserve"> </w:t>
+      </w:r>
+      <w:r>
+        <w:t xml:space="preserve">guias de uso, tutoriais do fluxo (wizard → projeto → relatórios) e recomendações de qualidade.</w:t>
       </w:r>
     </w:p>
     <w:p>
@@ -1672,7 +1750,22 @@
         <w:pStyle w:val="FirstParagraph"/>
       </w:pPr>
       <w:r>
-        <w:t xml:space="preserve">Estratégia de implementação e validação (em alto nível, sem restringir a uma única abordagem):</w:t>
+        <w:t xml:space="preserve">O objetivo é permitir um artigo focado no software como ferramenta científica, com resultados de</w:t>
+      </w:r>
+      <w:r>
+        <w:t xml:space="preserve"> </w:t>
+      </w:r>
+      <w:r>
+        <w:t xml:space="preserve">validação e aplicabilidade em etologia e neuropsicofarmacologia.</w:t>
+      </w:r>
+    </w:p>
+    <w:bookmarkStart w:id="15" w:name="Xe1e267584799bfb7ec895500c752fdd1e55586a"/>
+    <w:p>
+      <w:pPr>
+        <w:pStyle w:val="Heading4"/>
+      </w:pPr>
+      <w:r>
+        <w:t xml:space="preserve">Complemento (público-alvo leigo): o que será explicado no artigo/documentação</w:t>
       </w:r>
     </w:p>
     <w:p>
@@ -1684,7 +1777,13 @@
         </w:numPr>
       </w:pPr>
       <w:r>
-        <w:t xml:space="preserve">Melhorias no rastreio multiobjeto (consistência temporal e tratamento de oclusões).</w:t>
+        <w:t xml:space="preserve">O que significa “treinar” IA (mostrar milhares de exemplos anotados para o modelo aprender o</w:t>
+      </w:r>
+      <w:r>
+        <w:t xml:space="preserve"> </w:t>
+      </w:r>
+      <w:r>
+        <w:t xml:space="preserve">padrão do peixe, como um treinamento supervisionado).</w:t>
       </w:r>
     </w:p>
     <w:p>
@@ -1696,7 +1795,7 @@
         </w:numPr>
       </w:pPr>
       <w:r>
-        <w:t xml:space="preserve">Uso de descritores visuais/temporais (quando aplicável) para reduzir trocas de identidade.</w:t>
+        <w:t xml:space="preserve">O que são métricas como precisão/recall/mAP e por que elas importam para não “perder o animal”.</w:t>
       </w:r>
     </w:p>
     <w:p>
@@ -1708,41 +1807,24 @@
         </w:numPr>
       </w:pPr>
       <w:r>
-        <w:t xml:space="preserve">Geração de métricas de qualidade e rotinas de checagem para quantificar a estabilidade de</w:t>
-      </w:r>
-      <w:r>
-        <w:t xml:space="preserve"> </w:t>
-      </w:r>
-      <w:r>
-        <w:t xml:space="preserve">identidade ao longo do vídeo.</w:t>
-      </w:r>
-    </w:p>
-    <w:p>
-      <w:pPr>
-        <w:pStyle w:val="Compact"/>
-        <w:numPr>
-          <w:ilvl w:val="0"/>
-          <w:numId w:val="1008"/>
-        </w:numPr>
-      </w:pPr>
-      <w:r>
-        <w:t xml:space="preserve">Testes controlados com vídeos em condições progressivamente mais difíceis (densidade de</w:t>
-      </w:r>
-      <w:r>
-        <w:t xml:space="preserve"> </w:t>
-      </w:r>
-      <w:r>
-        <w:t xml:space="preserve">animais, iluminação, reflexos, ruído, variações de aparato).</w:t>
-      </w:r>
-    </w:p>
-    <w:bookmarkEnd w:id="14"/>
-    <w:bookmarkStart w:id="15" w:name="X7c2586f033fefa2c8ecf066a3bf7a1e1b90fa46"/>
+        <w:t xml:space="preserve">Por que ajustes (parâmetros) existem e como eles se relacionam a problemas reais de laboratório</w:t>
+      </w:r>
+      <w:r>
+        <w:t xml:space="preserve"> </w:t>
+      </w:r>
+      <w:r>
+        <w:t xml:space="preserve">(reflexos, baixa luz, oclusão, ruído), sem depender de programação.</w:t>
+      </w:r>
+    </w:p>
+    <w:bookmarkEnd w:id="15"/>
+    <w:bookmarkEnd w:id="16"/>
+    <w:bookmarkStart w:id="17" w:name="Xce8a6a517cf8917971ee3eabba86a6244db9818"/>
     <w:p>
       <w:pPr>
         <w:pStyle w:val="Heading3"/>
       </w:pPr>
       <w:r>
-        <w:t xml:space="preserve">3.3 Estudos de interação social e comportamento gregário (métricas e validação)</w:t>
+        <w:t xml:space="preserve">3.2 Identificação individual dos animais (rastreamento longitudinal e persistência de identidade)</w:t>
       </w:r>
     </w:p>
     <w:p>
@@ -1750,21 +1832,29 @@
         <w:pStyle w:val="FirstParagraph"/>
       </w:pPr>
       <w:r>
-        <w:t xml:space="preserve">Com a identificação individual e rastreio robusto, será possível ampliar o software para análises</w:t>
-      </w:r>
-      <w:r>
-        <w:t xml:space="preserve"> </w:t>
-      </w:r>
-      <w:r>
-        <w:t xml:space="preserve">etológicas de maior relevância, com foco em comportamento gregário e interação social.</w:t>
-      </w:r>
-    </w:p>
-    <w:p>
-      <w:pPr>
-        <w:pStyle w:val="BodyText"/>
-      </w:pPr>
-      <w:r>
-        <w:t xml:space="preserve">O plano contempla:</w:t>
+        <w:t xml:space="preserve">Para ampliar a capacidade científica do ZebTrack-AI, será desenvolvida uma camada que permita</w:t>
+      </w:r>
+      <w:r>
+        <w:t xml:space="preserve"> </w:t>
+      </w:r>
+      <w:r>
+        <w:t xml:space="preserve">associar uma</w:t>
+      </w:r>
+      <w:r>
+        <w:t xml:space="preserve"> </w:t>
+      </w:r>
+      <w:r>
+        <w:rPr>
+          <w:b/>
+          <w:bCs/>
+        </w:rPr>
+        <w:t xml:space="preserve">identidade persistente</w:t>
+      </w:r>
+      <w:r>
+        <w:t xml:space="preserve"> </w:t>
+      </w:r>
+      <w:r>
+        <w:t xml:space="preserve">aos animais ao longo do tempo, essencial para:</w:t>
       </w:r>
     </w:p>
     <w:p>
@@ -1776,19 +1866,7 @@
         </w:numPr>
       </w:pPr>
       <w:r>
-        <w:t xml:space="preserve">Definição e implementação de métricas sociais clássicas e aplicáveis ao aparato do laboratório</w:t>
-      </w:r>
-      <w:r>
-        <w:t xml:space="preserve"> </w:t>
-      </w:r>
-      <w:r>
-        <w:t xml:space="preserve">(distâncias interindividuais, coesão, vizinhança, aproximação/afastamento, sincronização de</w:t>
-      </w:r>
-      <w:r>
-        <w:t xml:space="preserve"> </w:t>
-      </w:r>
-      <w:r>
-        <w:t xml:space="preserve">movimento, liderança/seguimento e padrões de agrupamento).</w:t>
+        <w:t xml:space="preserve">Estudos longitudinais indivíduo-a-indivíduo.</w:t>
       </w:r>
     </w:p>
     <w:p>
@@ -1800,13 +1878,7 @@
         </w:numPr>
       </w:pPr>
       <w:r>
-        <w:t xml:space="preserve">Construção de saídas padronizadas para análise estatística longitudinal (R), mantendo</w:t>
-      </w:r>
-      <w:r>
-        <w:t xml:space="preserve"> </w:t>
-      </w:r>
-      <w:r>
-        <w:t xml:space="preserve">compatibilidade com estudos anteriores.</w:t>
+        <w:t xml:space="preserve">Redução de ambiguidades em cruzamentos, oclusões e aproximações.</w:t>
       </w:r>
     </w:p>
     <w:p>
@@ -1818,23 +1890,13 @@
         </w:numPr>
       </w:pPr>
       <w:r>
-        <w:t xml:space="preserve">Validação com experimentos de referência do grupo e comparação com análises manuais ou</w:t>
-      </w:r>
-      <w:r>
-        <w:t xml:space="preserve"> </w:t>
-      </w:r>
-      <w:r>
-        <w:t xml:space="preserve">semiautomáticas quando necessário.</w:t>
-      </w:r>
-    </w:p>
-    <w:bookmarkEnd w:id="15"/>
-    <w:bookmarkStart w:id="16" w:name="X58d2471900499094ab62dfb03b0a907320d8030"/>
-    <w:p>
-      <w:pPr>
-        <w:pStyle w:val="Heading3"/>
-      </w:pPr>
-      <w:r>
-        <w:t xml:space="preserve">3.4 Módulo de análise em período noturno (baixa luminosidade) e novos etogramas</w:t>
+        <w:t xml:space="preserve">Extração de métricas individuais confiáveis (velocidade, freezing, padrões espaciais,</w:t>
+      </w:r>
+      <w:r>
+        <w:t xml:space="preserve"> </w:t>
+      </w:r>
+      <w:r>
+        <w:t xml:space="preserve">preferências, latências, etc.).</w:t>
       </w:r>
     </w:p>
     <w:p>
@@ -1842,13 +1904,7 @@
         <w:pStyle w:val="FirstParagraph"/>
       </w:pPr>
       <w:r>
-        <w:t xml:space="preserve">O período noturno representa uma janela de comportamento relevante e, frequentemente, pouco</w:t>
-      </w:r>
-      <w:r>
-        <w:t xml:space="preserve"> </w:t>
-      </w:r>
-      <w:r>
-        <w:t xml:space="preserve">explorada por limitações metodológicas. A prorrogação viabiliza:</w:t>
+        <w:t xml:space="preserve">Estratégia de implementação e validação (em alto nível, sem restringir a uma única abordagem):</w:t>
       </w:r>
     </w:p>
     <w:p>
@@ -1860,23 +1916,7 @@
         </w:numPr>
       </w:pPr>
       <w:r>
-        <w:t xml:space="preserve">Desenvolvimento de um modo de aquisição e/ou processamento para</w:t>
-      </w:r>
-      <w:r>
-        <w:t xml:space="preserve"> </w:t>
-      </w:r>
-      <w:r>
-        <w:rPr>
-          <w:b/>
-          <w:bCs/>
-        </w:rPr>
-        <w:t xml:space="preserve">baixa luminosidade</w:t>
-      </w:r>
-      <w:r>
-        <w:t xml:space="preserve"> </w:t>
-      </w:r>
-      <w:r>
-        <w:t xml:space="preserve">(incluindo ajustes do pipeline e testes de robustez).</w:t>
+        <w:t xml:space="preserve">Melhorias no rastreio multiobjeto (consistência temporal e tratamento de oclusões).</w:t>
       </w:r>
     </w:p>
     <w:p>
@@ -1888,13 +1928,7 @@
         </w:numPr>
       </w:pPr>
       <w:r>
-        <w:t xml:space="preserve">Definição de rotinas para avaliar alterações comportamentais noturnas (atividade, repouso,</w:t>
-      </w:r>
-      <w:r>
-        <w:t xml:space="preserve"> </w:t>
-      </w:r>
-      <w:r>
-        <w:t xml:space="preserve">exploração, padrões espaciais e possíveis mudanças de interação social).</w:t>
+        <w:t xml:space="preserve">Uso de descritores visuais/temporais (quando aplicável) para reduzir trocas de identidade.</w:t>
       </w:r>
     </w:p>
     <w:p>
@@ -1906,7 +1940,41 @@
         </w:numPr>
       </w:pPr>
       <w:r>
-        <w:t xml:space="preserve">Ampliação do etograma digital com eventos associados ao contexto noturno.</w:t>
+        <w:t xml:space="preserve">Geração de métricas de qualidade e rotinas de checagem para quantificar a estabilidade de</w:t>
+      </w:r>
+      <w:r>
+        <w:t xml:space="preserve"> </w:t>
+      </w:r>
+      <w:r>
+        <w:t xml:space="preserve">identidade ao longo do vídeo.</w:t>
+      </w:r>
+    </w:p>
+    <w:p>
+      <w:pPr>
+        <w:pStyle w:val="Compact"/>
+        <w:numPr>
+          <w:ilvl w:val="0"/>
+          <w:numId w:val="1010"/>
+        </w:numPr>
+      </w:pPr>
+      <w:r>
+        <w:t xml:space="preserve">Testes controlados com vídeos em condições progressivamente mais difíceis (densidade de</w:t>
+      </w:r>
+      <w:r>
+        <w:t xml:space="preserve"> </w:t>
+      </w:r>
+      <w:r>
+        <w:t xml:space="preserve">animais, iluminação, reflexos, ruído, variações de aparato).</w:t>
+      </w:r>
+    </w:p>
+    <w:bookmarkEnd w:id="17"/>
+    <w:bookmarkStart w:id="18" w:name="X7c2586f033fefa2c8ecf066a3bf7a1e1b90fa46"/>
+    <w:p>
+      <w:pPr>
+        <w:pStyle w:val="Heading3"/>
+      </w:pPr>
+      <w:r>
+        <w:t xml:space="preserve">3.3 Estudos de interação social e comportamento gregário (métricas e validação)</w:t>
       </w:r>
     </w:p>
     <w:p>
@@ -1914,37 +1982,21 @@
         <w:pStyle w:val="FirstParagraph"/>
       </w:pPr>
       <w:r>
-        <w:t xml:space="preserve">Essa frente é diretamente alinhada ao objetivo de “levar o estudo etológico de zebrafish a outro</w:t>
-      </w:r>
-      <w:r>
-        <w:t xml:space="preserve"> </w:t>
-      </w:r>
-      <w:r>
-        <w:t xml:space="preserve">nível de excelência, automação e eficácia”, com evidências quantitativas e reprodutíveis.</w:t>
-      </w:r>
-    </w:p>
-    <w:bookmarkEnd w:id="16"/>
-    <w:bookmarkStart w:id="17" w:name="X09e6cc56acdc9bf8bb9b4f7bffa9e1ce2d36282"/>
-    <w:p>
-      <w:pPr>
-        <w:pStyle w:val="Heading3"/>
-      </w:pPr>
-      <w:r>
-        <w:t xml:space="preserve">3.5 Validação colaborativa com pesquisadores do grupo e replicabilidade</w:t>
-      </w:r>
-    </w:p>
-    <w:p>
-      <w:pPr>
-        <w:pStyle w:val="FirstParagraph"/>
-      </w:pPr>
-      <w:r>
-        <w:t xml:space="preserve">As novas funções propostas surgiram ao longo do desenvolvimento do software e serão</w:t>
-      </w:r>
-      <w:r>
-        <w:t xml:space="preserve"> </w:t>
-      </w:r>
-      <w:r>
-        <w:t xml:space="preserve">consolidadas com uma etapa dedicada de validação colaborativa:</w:t>
+        <w:t xml:space="preserve">Com a identificação individual e rastreio robusto, será possível ampliar o software para análises</w:t>
+      </w:r>
+      <w:r>
+        <w:t xml:space="preserve"> </w:t>
+      </w:r>
+      <w:r>
+        <w:t xml:space="preserve">etológicas de maior relevância, com foco em comportamento gregário e interação social.</w:t>
+      </w:r>
+    </w:p>
+    <w:p>
+      <w:pPr>
+        <w:pStyle w:val="BodyText"/>
+      </w:pPr>
+      <w:r>
+        <w:t xml:space="preserve">O plano contempla:</w:t>
       </w:r>
     </w:p>
     <w:p>
@@ -1956,13 +2008,19 @@
         </w:numPr>
       </w:pPr>
       <w:r>
-        <w:t xml:space="preserve">Sessões de testes com colegas pesquisadores do grupo, para avaliar usabilidade e robustez em</w:t>
-      </w:r>
-      <w:r>
-        <w:t xml:space="preserve"> </w:t>
-      </w:r>
-      <w:r>
-        <w:t xml:space="preserve">cenários reais (diferentes operadores e rotinas).</w:t>
+        <w:t xml:space="preserve">Definição e implementação de métricas sociais clássicas e aplicáveis ao aparato do laboratório</w:t>
+      </w:r>
+      <w:r>
+        <w:t xml:space="preserve"> </w:t>
+      </w:r>
+      <w:r>
+        <w:t xml:space="preserve">(distâncias interindividuais, coesão, vizinhança, aproximação/afastamento, sincronização de</w:t>
+      </w:r>
+      <w:r>
+        <w:t xml:space="preserve"> </w:t>
+      </w:r>
+      <w:r>
+        <w:t xml:space="preserve">movimento, liderança/seguimento e padrões de agrupamento).</w:t>
       </w:r>
     </w:p>
     <w:p>
@@ -1974,7 +2032,13 @@
         </w:numPr>
       </w:pPr>
       <w:r>
-        <w:t xml:space="preserve">Coleta de feedback estruturado e ajustes de interface/fluxo (sem perder reprodutibilidade).</w:t>
+        <w:t xml:space="preserve">Construção de saídas padronizadas para análise estatística longitudinal (R), mantendo</w:t>
+      </w:r>
+      <w:r>
+        <w:t xml:space="preserve"> </w:t>
+      </w:r>
+      <w:r>
+        <w:t xml:space="preserve">compatibilidade com estudos anteriores.</w:t>
       </w:r>
     </w:p>
     <w:p>
@@ -1986,6 +2050,174 @@
         </w:numPr>
       </w:pPr>
       <w:r>
+        <w:t xml:space="preserve">Validação com experimentos de referência do grupo e comparação com análises manuais ou</w:t>
+      </w:r>
+      <w:r>
+        <w:t xml:space="preserve"> </w:t>
+      </w:r>
+      <w:r>
+        <w:t xml:space="preserve">semiautomáticas quando necessário.</w:t>
+      </w:r>
+    </w:p>
+    <w:bookmarkEnd w:id="18"/>
+    <w:bookmarkStart w:id="19" w:name="X58d2471900499094ab62dfb03b0a907320d8030"/>
+    <w:p>
+      <w:pPr>
+        <w:pStyle w:val="Heading3"/>
+      </w:pPr>
+      <w:r>
+        <w:t xml:space="preserve">3.4 Módulo de análise em período noturno (baixa luminosidade) e novos etogramas</w:t>
+      </w:r>
+    </w:p>
+    <w:p>
+      <w:pPr>
+        <w:pStyle w:val="FirstParagraph"/>
+      </w:pPr>
+      <w:r>
+        <w:t xml:space="preserve">O período noturno representa uma janela de comportamento relevante e, frequentemente, pouco</w:t>
+      </w:r>
+      <w:r>
+        <w:t xml:space="preserve"> </w:t>
+      </w:r>
+      <w:r>
+        <w:t xml:space="preserve">explorada por limitações metodológicas. A prorrogação viabiliza:</w:t>
+      </w:r>
+    </w:p>
+    <w:p>
+      <w:pPr>
+        <w:pStyle w:val="Compact"/>
+        <w:numPr>
+          <w:ilvl w:val="0"/>
+          <w:numId w:val="1012"/>
+        </w:numPr>
+      </w:pPr>
+      <w:r>
+        <w:t xml:space="preserve">Desenvolvimento de um modo de aquisição e/ou processamento para</w:t>
+      </w:r>
+      <w:r>
+        <w:t xml:space="preserve"> </w:t>
+      </w:r>
+      <w:r>
+        <w:rPr>
+          <w:b/>
+          <w:bCs/>
+        </w:rPr>
+        <w:t xml:space="preserve">baixa luminosidade</w:t>
+      </w:r>
+      <w:r>
+        <w:t xml:space="preserve"> </w:t>
+      </w:r>
+      <w:r>
+        <w:t xml:space="preserve">(incluindo ajustes do pipeline e testes de robustez).</w:t>
+      </w:r>
+    </w:p>
+    <w:p>
+      <w:pPr>
+        <w:pStyle w:val="Compact"/>
+        <w:numPr>
+          <w:ilvl w:val="0"/>
+          <w:numId w:val="1012"/>
+        </w:numPr>
+      </w:pPr>
+      <w:r>
+        <w:t xml:space="preserve">Definição de rotinas para avaliar alterações comportamentais noturnas (atividade, repouso,</w:t>
+      </w:r>
+      <w:r>
+        <w:t xml:space="preserve"> </w:t>
+      </w:r>
+      <w:r>
+        <w:t xml:space="preserve">exploração, padrões espaciais e possíveis mudanças de interação social).</w:t>
+      </w:r>
+    </w:p>
+    <w:p>
+      <w:pPr>
+        <w:pStyle w:val="Compact"/>
+        <w:numPr>
+          <w:ilvl w:val="0"/>
+          <w:numId w:val="1012"/>
+        </w:numPr>
+      </w:pPr>
+      <w:r>
+        <w:t xml:space="preserve">Ampliação do etograma digital com eventos associados ao contexto noturno.</w:t>
+      </w:r>
+    </w:p>
+    <w:p>
+      <w:pPr>
+        <w:pStyle w:val="FirstParagraph"/>
+      </w:pPr>
+      <w:r>
+        <w:t xml:space="preserve">Essa frente é diretamente alinhada ao objetivo de “levar o estudo etológico de zebrafish a outro</w:t>
+      </w:r>
+      <w:r>
+        <w:t xml:space="preserve"> </w:t>
+      </w:r>
+      <w:r>
+        <w:t xml:space="preserve">nível de excelência, automação e eficácia”, com evidências quantitativas e reprodutíveis.</w:t>
+      </w:r>
+    </w:p>
+    <w:bookmarkEnd w:id="19"/>
+    <w:bookmarkStart w:id="20" w:name="X09e6cc56acdc9bf8bb9b4f7bffa9e1ce2d36282"/>
+    <w:p>
+      <w:pPr>
+        <w:pStyle w:val="Heading3"/>
+      </w:pPr>
+      <w:r>
+        <w:t xml:space="preserve">3.5 Validação colaborativa com pesquisadores do grupo e replicabilidade</w:t>
+      </w:r>
+    </w:p>
+    <w:p>
+      <w:pPr>
+        <w:pStyle w:val="FirstParagraph"/>
+      </w:pPr>
+      <w:r>
+        <w:t xml:space="preserve">As novas funções propostas surgiram ao longo do desenvolvimento do software e serão</w:t>
+      </w:r>
+      <w:r>
+        <w:t xml:space="preserve"> </w:t>
+      </w:r>
+      <w:r>
+        <w:t xml:space="preserve">consolidadas com uma etapa dedicada de validação colaborativa:</w:t>
+      </w:r>
+    </w:p>
+    <w:p>
+      <w:pPr>
+        <w:pStyle w:val="Compact"/>
+        <w:numPr>
+          <w:ilvl w:val="0"/>
+          <w:numId w:val="1013"/>
+        </w:numPr>
+      </w:pPr>
+      <w:r>
+        <w:t xml:space="preserve">Sessões de testes com colegas pesquisadores do grupo, para avaliar usabilidade e robustez em</w:t>
+      </w:r>
+      <w:r>
+        <w:t xml:space="preserve"> </w:t>
+      </w:r>
+      <w:r>
+        <w:t xml:space="preserve">cenários reais (diferentes operadores e rotinas).</w:t>
+      </w:r>
+    </w:p>
+    <w:p>
+      <w:pPr>
+        <w:pStyle w:val="Compact"/>
+        <w:numPr>
+          <w:ilvl w:val="0"/>
+          <w:numId w:val="1013"/>
+        </w:numPr>
+      </w:pPr>
+      <w:r>
+        <w:t xml:space="preserve">Coleta de feedback estruturado e ajustes de interface/fluxo (sem perder reprodutibilidade).</w:t>
+      </w:r>
+    </w:p>
+    <w:p>
+      <w:pPr>
+        <w:pStyle w:val="Compact"/>
+        <w:numPr>
+          <w:ilvl w:val="0"/>
+          <w:numId w:val="1013"/>
+        </w:numPr>
+      </w:pPr>
+      <w:r>
         <w:t xml:space="preserve">Validação de consistência dos resultados e comparação entre execuções.</w:t>
       </w:r>
     </w:p>
@@ -2046,9 +2278,9 @@
         </w:pict>
       </w:r>
     </w:p>
-    <w:bookmarkEnd w:id="17"/>
-    <w:bookmarkEnd w:id="18"/>
-    <w:bookmarkStart w:id="19" w:name="cronograma-de-execução-12-meses"/>
+    <w:bookmarkEnd w:id="20"/>
+    <w:bookmarkEnd w:id="21"/>
+    <w:bookmarkStart w:id="22" w:name="cronograma-de-execução-12-meses"/>
     <w:p>
       <w:pPr>
         <w:pStyle w:val="Heading2"/>
@@ -3103,8 +3335,8 @@
         </w:pict>
       </w:r>
     </w:p>
-    <w:bookmarkEnd w:id="19"/>
-    <w:bookmarkStart w:id="22" w:name="bibliografia"/>
+    <w:bookmarkEnd w:id="22"/>
+    <w:bookmarkStart w:id="25" w:name="bibliografia"/>
     <w:p>
       <w:pPr>
         <w:pStyle w:val="Heading2"/>
@@ -3307,7 +3539,7 @@
       <w:r>
         <w:t xml:space="preserve"> </w:t>
       </w:r>
-      <w:hyperlink r:id="rId20">
+      <w:hyperlink r:id="rId23">
         <w:r>
           <w:rPr>
             <w:rStyle w:val="Hyperlink"/>
@@ -3376,7 +3608,7 @@
       <w:r>
         <w:t xml:space="preserve"> </w:t>
       </w:r>
-      <w:hyperlink r:id="rId21">
+      <w:hyperlink r:id="rId24">
         <w:r>
           <w:rPr>
             <w:rStyle w:val="Hyperlink"/>
@@ -3476,7 +3708,8 @@
         <w:t xml:space="preserve">, v. 2023, 2023.</w:t>
       </w:r>
     </w:p>
-    <w:bookmarkEnd w:id="22"/>
+    <w:bookmarkEnd w:id="25"/>
+    <w:bookmarkEnd w:id="26"/>
     <w:sectPr>
       <w:footnotePr>
         <w:numRestart w:val="eachSect"/>
@@ -3666,6 +3899,91 @@
       <w:start w:val="1"/>
       <w:numFmt w:val="decimal"/>
       <w:lvlText w:val="%9."/>
+      <w:lvlJc w:val="left"/>
+      <w:pPr>
+        <w:ind w:left="6480" w:hanging="360"/>
+      </w:pPr>
+    </w:lvl>
+  </w:abstractNum>
+  <w:abstractNum w:abstractNumId="99421">
+    <w:nsid w:val="00A99421"/>
+    <w:multiLevelType w:val="multilevel"/>
+    <w:lvl w:ilvl="0">
+      <w:start w:val="1"/>
+      <w:numFmt w:val="decimal"/>
+      <w:lvlText w:val="%1)"/>
+      <w:lvlJc w:val="left"/>
+      <w:pPr>
+        <w:ind w:left="720" w:hanging="360"/>
+      </w:pPr>
+    </w:lvl>
+    <w:lvl w:ilvl="1">
+      <w:start w:val="1"/>
+      <w:numFmt w:val="decimal"/>
+      <w:lvlText w:val="%2)"/>
+      <w:lvlJc w:val="left"/>
+      <w:pPr>
+        <w:ind w:left="1440" w:hanging="360"/>
+      </w:pPr>
+    </w:lvl>
+    <w:lvl w:ilvl="2">
+      <w:start w:val="1"/>
+      <w:numFmt w:val="decimal"/>
+      <w:lvlText w:val="%3)"/>
+      <w:lvlJc w:val="left"/>
+      <w:pPr>
+        <w:ind w:left="2160" w:hanging="360"/>
+      </w:pPr>
+    </w:lvl>
+    <w:lvl w:ilvl="3">
+      <w:start w:val="1"/>
+      <w:numFmt w:val="decimal"/>
+      <w:lvlText w:val="%4)"/>
+      <w:lvlJc w:val="left"/>
+      <w:pPr>
+        <w:ind w:left="2880" w:hanging="360"/>
+      </w:pPr>
+    </w:lvl>
+    <w:lvl w:ilvl="4">
+      <w:start w:val="1"/>
+      <w:numFmt w:val="decimal"/>
+      <w:lvlText w:val="%5)"/>
+      <w:lvlJc w:val="left"/>
+      <w:pPr>
+        <w:ind w:left="3600" w:hanging="360"/>
+      </w:pPr>
+    </w:lvl>
+    <w:lvl w:ilvl="5">
+      <w:start w:val="1"/>
+      <w:numFmt w:val="decimal"/>
+      <w:lvlText w:val="%6)"/>
+      <w:lvlJc w:val="left"/>
+      <w:pPr>
+        <w:ind w:left="4320" w:hanging="360"/>
+      </w:pPr>
+    </w:lvl>
+    <w:lvl w:ilvl="6">
+      <w:start w:val="1"/>
+      <w:numFmt w:val="decimal"/>
+      <w:lvlText w:val="%7)"/>
+      <w:lvlJc w:val="left"/>
+      <w:pPr>
+        <w:ind w:left="5040" w:hanging="360"/>
+      </w:pPr>
+    </w:lvl>
+    <w:lvl w:ilvl="7">
+      <w:start w:val="1"/>
+      <w:numFmt w:val="decimal"/>
+      <w:lvlText w:val="%8)"/>
+      <w:lvlJc w:val="left"/>
+      <w:pPr>
+        <w:ind w:left="5760" w:hanging="360"/>
+      </w:pPr>
+    </w:lvl>
+    <w:lvl w:ilvl="8">
+      <w:start w:val="1"/>
+      <w:numFmt w:val="decimal"/>
+      <w:lvlText w:val="%9)"/>
       <w:lvlJc w:val="left"/>
       <w:pPr>
         <w:ind w:left="6480" w:hanging="360"/>
@@ -3809,9 +4127,39 @@
     </w:lvlOverride>
   </w:num>
   <w:num w:numId="1002">
+    <w:abstractNumId w:val="99421"/>
+    <w:lvlOverride w:ilvl="0">
+      <w:startOverride w:val="1"/>
+    </w:lvlOverride>
+    <w:lvlOverride w:ilvl="1">
+      <w:startOverride w:val="1"/>
+    </w:lvlOverride>
+    <w:lvlOverride w:ilvl="2">
+      <w:startOverride w:val="1"/>
+    </w:lvlOverride>
+    <w:lvlOverride w:ilvl="3">
+      <w:startOverride w:val="1"/>
+    </w:lvlOverride>
+    <w:lvlOverride w:ilvl="4">
+      <w:startOverride w:val="1"/>
+    </w:lvlOverride>
+    <w:lvlOverride w:ilvl="5">
+      <w:startOverride w:val="1"/>
+    </w:lvlOverride>
+    <w:lvlOverride w:ilvl="6">
+      <w:startOverride w:val="1"/>
+    </w:lvlOverride>
+    <w:lvlOverride w:ilvl="7">
+      <w:startOverride w:val="1"/>
+    </w:lvlOverride>
+    <w:lvlOverride w:ilvl="8">
+      <w:startOverride w:val="1"/>
+    </w:lvlOverride>
+  </w:num>
+  <w:num w:numId="1003">
     <w:abstractNumId w:val="991"/>
   </w:num>
-  <w:num w:numId="1003">
+  <w:num w:numId="1004">
     <w:abstractNumId w:val="99411"/>
     <w:lvlOverride w:ilvl="0">
       <w:startOverride w:val="1"/>
@@ -3841,9 +4189,6 @@
       <w:startOverride w:val="1"/>
     </w:lvlOverride>
   </w:num>
-  <w:num w:numId="1004">
-    <w:abstractNumId w:val="991"/>
-  </w:num>
   <w:num w:numId="1005">
     <w:abstractNumId w:val="991"/>
   </w:num>
@@ -3863,6 +4208,12 @@
     <w:abstractNumId w:val="991"/>
   </w:num>
   <w:num w:numId="1011">
+    <w:abstractNumId w:val="991"/>
+  </w:num>
+  <w:num w:numId="1012">
+    <w:abstractNumId w:val="991"/>
+  </w:num>
+  <w:num w:numId="1013">
     <w:abstractNumId w:val="991"/>
   </w:num>
 </w:numbering>

</xml_diff>

<commit_message>
docs: add limitations, reproducibility and glossary
</commit_message>
<xml_diff>
--- a/exports/word/Cópia de Projeto_Prorrogacao_Excepcional_Aceita_v1.docx
+++ b/exports/word/Cópia de Projeto_Prorrogacao_Excepcional_Aceita_v1.docx
@@ -2,7 +2,7 @@
 <file path=word/document.xml><?xml version="1.0" encoding="utf-8"?>
 <w:document xmlns:w="http://schemas.openxmlformats.org/wordprocessingml/2006/main" xmlns:m="http://schemas.openxmlformats.org/officeDocument/2006/math" xmlns:r="http://schemas.openxmlformats.org/officeDocument/2006/relationships" xmlns:o="urn:schemas-microsoft-com:office:office" xmlns:v="urn:schemas-microsoft-com:vml" xmlns:w10="urn:schemas-microsoft-com:office:word" xmlns:a="http://schemas.openxmlformats.org/drawingml/2006/main" xmlns:pic="http://schemas.openxmlformats.org/drawingml/2006/picture" xmlns:wp="http://schemas.openxmlformats.org/drawingml/2006/wordprocessingDrawing">
   <w:body>
-    <w:bookmarkStart w:id="26" w:name="X6afc8a15ddbf7aff4476773eaa6898cbb17527e"/>
+    <w:bookmarkStart w:id="29" w:name="X6afc8a15ddbf7aff4476773eaa6898cbb17527e"/>
     <w:p>
       <w:pPr>
         <w:pStyle w:val="Heading1"/>
@@ -1585,7 +1585,7 @@
     </w:p>
     <w:bookmarkEnd w:id="13"/>
     <w:bookmarkEnd w:id="14"/>
-    <w:bookmarkStart w:id="21" w:name="X6cbe77c84a9e2da2db6764aec60a03cadee2a54"/>
+    <w:bookmarkStart w:id="24" w:name="X6cbe77c84a9e2da2db6764aec60a03cadee2a54"/>
     <w:p>
       <w:pPr>
         <w:pStyle w:val="Heading2"/>
@@ -1594,7 +1594,7 @@
         <w:t xml:space="preserve">3. Metodologia e plano de execução do período prorrogado</w:t>
       </w:r>
     </w:p>
-    <w:bookmarkStart w:id="16" w:name="X32869231436294760c3d1d6b399f20f21960ee9"/>
+    <w:bookmarkStart w:id="19" w:name="X32869231436294760c3d1d6b399f20f21960ee9"/>
     <w:p>
       <w:pPr>
         <w:pStyle w:val="Heading3"/>
@@ -1817,14 +1817,13 @@
       </w:r>
     </w:p>
     <w:bookmarkEnd w:id="15"/>
-    <w:bookmarkEnd w:id="16"/>
-    <w:bookmarkStart w:id="17" w:name="Xce8a6a517cf8917971ee3eabba86a6244db9818"/>
-    <w:p>
-      <w:pPr>
-        <w:pStyle w:val="Heading3"/>
-      </w:pPr>
-      <w:r>
-        <w:t xml:space="preserve">3.2 Identificação individual dos animais (rastreamento longitudinal e persistência de identidade)</w:t>
+    <w:bookmarkStart w:id="16" w:name="X5b1256f9350f929c56d05f5c58f59b4aec1f83b"/>
+    <w:p>
+      <w:pPr>
+        <w:pStyle w:val="Heading4"/>
+      </w:pPr>
+      <w:r>
+        <w:t xml:space="preserve">Limitações práticas (e como serão tratadas na validação)</w:t>
       </w:r>
     </w:p>
     <w:p>
@@ -1832,29 +1831,13 @@
         <w:pStyle w:val="FirstParagraph"/>
       </w:pPr>
       <w:r>
-        <w:t xml:space="preserve">Para ampliar a capacidade científica do ZebTrack-AI, será desenvolvida uma camada que permita</w:t>
-      </w:r>
-      <w:r>
-        <w:t xml:space="preserve"> </w:t>
-      </w:r>
-      <w:r>
-        <w:t xml:space="preserve">associar uma</w:t>
-      </w:r>
-      <w:r>
-        <w:t xml:space="preserve"> </w:t>
-      </w:r>
-      <w:r>
-        <w:rPr>
-          <w:b/>
-          <w:bCs/>
-        </w:rPr>
-        <w:t xml:space="preserve">identidade persistente</w:t>
-      </w:r>
-      <w:r>
-        <w:t xml:space="preserve"> </w:t>
-      </w:r>
-      <w:r>
-        <w:t xml:space="preserve">aos animais ao longo do tempo, essencial para:</w:t>
+        <w:t xml:space="preserve">Para que o software seja publicável como método, é importante explicitar as limitações típicas de</w:t>
+      </w:r>
+      <w:r>
+        <w:t xml:space="preserve"> </w:t>
+      </w:r>
+      <w:r>
+        <w:t xml:space="preserve">vídeos reais e como elas são mitigadas (evitando que artefatos virem “efeitos”):</w:t>
       </w:r>
     </w:p>
     <w:p>
@@ -1866,7 +1849,17 @@
         </w:numPr>
       </w:pPr>
       <w:r>
-        <w:t xml:space="preserve">Estudos longitudinais indivíduo-a-indivíduo.</w:t>
+        <w:rPr>
+          <w:b/>
+          <w:bCs/>
+        </w:rPr>
+        <w:t xml:space="preserve">Reflexos/ondulação/bolhas</w:t>
+      </w:r>
+      <w:r>
+        <w:t xml:space="preserve"> </w:t>
+      </w:r>
+      <w:r>
+        <w:t xml:space="preserve">podem gerar detecções falsas ou perda temporária do animal.</w:t>
       </w:r>
     </w:p>
     <w:p>
@@ -1878,7 +1871,23 @@
         </w:numPr>
       </w:pPr>
       <w:r>
-        <w:t xml:space="preserve">Redução de ambiguidades em cruzamentos, oclusões e aproximações.</w:t>
+        <w:rPr>
+          <w:b/>
+          <w:bCs/>
+        </w:rPr>
+        <w:t xml:space="preserve">Baixa luminosidade e variação de iluminação</w:t>
+      </w:r>
+      <w:r>
+        <w:t xml:space="preserve"> </w:t>
+      </w:r>
+      <w:r>
+        <w:t xml:space="preserve">alteram o contraste do peixe e a estabilidade do</w:t>
+      </w:r>
+      <w:r>
+        <w:t xml:space="preserve"> </w:t>
+      </w:r>
+      <w:r>
+        <w:t xml:space="preserve">rastreio.</w:t>
       </w:r>
     </w:p>
     <w:p>
@@ -1890,13 +1899,17 @@
         </w:numPr>
       </w:pPr>
       <w:r>
-        <w:t xml:space="preserve">Extração de métricas individuais confiáveis (velocidade, freezing, padrões espaciais,</w:t>
-      </w:r>
-      <w:r>
-        <w:t xml:space="preserve"> </w:t>
-      </w:r>
-      <w:r>
-        <w:t xml:space="preserve">preferências, latências, etc.).</w:t>
+        <w:rPr>
+          <w:b/>
+          <w:bCs/>
+        </w:rPr>
+        <w:t xml:space="preserve">Oclusões e cruzamentos</w:t>
+      </w:r>
+      <w:r>
+        <w:t xml:space="preserve"> </w:t>
+      </w:r>
+      <w:r>
+        <w:t xml:space="preserve">(em multi-animais) podem causar trocas de identidade.</w:t>
       </w:r>
     </w:p>
     <w:p>
@@ -1904,7 +1917,59 @@
         <w:pStyle w:val="FirstParagraph"/>
       </w:pPr>
       <w:r>
-        <w:t xml:space="preserve">Estratégia de implementação e validação (em alto nível, sem restringir a uma única abordagem):</w:t>
+        <w:t xml:space="preserve">O plano de validação inclui testes em condições progressivamente mais difíceis e comparação entre</w:t>
+      </w:r>
+      <w:r>
+        <w:t xml:space="preserve"> </w:t>
+      </w:r>
+      <w:r>
+        <w:t xml:space="preserve">configurações/métodos (detecção vs segmentação), com registro das escolhas e métricas de qualidade.</w:t>
+      </w:r>
+    </w:p>
+    <w:bookmarkEnd w:id="16"/>
+    <w:bookmarkStart w:id="17" w:name="Xe92080d02e364ceae5d54b47841271559b395eb"/>
+    <w:p>
+      <w:pPr>
+        <w:pStyle w:val="Heading4"/>
+      </w:pPr>
+      <w:r>
+        <w:t xml:space="preserve">Reprodutibilidade: o que fica registrado para auditoria e replicação</w:t>
+      </w:r>
+    </w:p>
+    <w:p>
+      <w:pPr>
+        <w:pStyle w:val="FirstParagraph"/>
+      </w:pPr>
+      <w:r>
+        <w:t xml:space="preserve">O ZebTrack-AI salva, junto aos dados, os elementos necessários para reprocessar e auditar uma</w:t>
+      </w:r>
+      <w:r>
+        <w:t xml:space="preserve"> </w:t>
+      </w:r>
+      <w:r>
+        <w:t xml:space="preserve">análise: versão do modelo/peso, parâmetros de detecção/rastreamento, calibração pixel→cm,</w:t>
+      </w:r>
+      <w:r>
+        <w:t xml:space="preserve"> </w:t>
+      </w:r>
+      <w:r>
+        <w:t xml:space="preserve">regras de zonas e configurações de processamento. Isso permite que diferentes operadores do grupo</w:t>
+      </w:r>
+      <w:r>
+        <w:t xml:space="preserve"> </w:t>
+      </w:r>
+      <w:r>
+        <w:t xml:space="preserve">utilizem o sistema mantendo o mesmo “protocolo digital”, reduzindo variabilidade de operador.</w:t>
+      </w:r>
+    </w:p>
+    <w:bookmarkEnd w:id="17"/>
+    <w:bookmarkStart w:id="18" w:name="glossário-rápido-leigo"/>
+    <w:p>
+      <w:pPr>
+        <w:pStyle w:val="Heading4"/>
+      </w:pPr>
+      <w:r>
+        <w:t xml:space="preserve">Glossário rápido (leigo)</w:t>
       </w:r>
     </w:p>
     <w:p>
@@ -1916,7 +1981,14 @@
         </w:numPr>
       </w:pPr>
       <w:r>
-        <w:t xml:space="preserve">Melhorias no rastreio multiobjeto (consistência temporal e tratamento de oclusões).</w:t>
+        <w:rPr>
+          <w:b/>
+          <w:bCs/>
+        </w:rPr>
+        <w:t xml:space="preserve">Modelo (IA)</w:t>
+      </w:r>
+      <w:r>
+        <w:t xml:space="preserve">: sistema que aprende a localizar o peixe no vídeo.</w:t>
       </w:r>
     </w:p>
     <w:p>
@@ -1928,7 +2000,14 @@
         </w:numPr>
       </w:pPr>
       <w:r>
-        <w:t xml:space="preserve">Uso de descritores visuais/temporais (quando aplicável) para reduzir trocas de identidade.</w:t>
+        <w:rPr>
+          <w:b/>
+          <w:bCs/>
+        </w:rPr>
+        <w:t xml:space="preserve">Treinamento</w:t>
+      </w:r>
+      <w:r>
+        <w:t xml:space="preserve">: aprender a partir de exemplos anotados.</w:t>
       </w:r>
     </w:p>
     <w:p>
@@ -1940,13 +2019,14 @@
         </w:numPr>
       </w:pPr>
       <w:r>
-        <w:t xml:space="preserve">Geração de métricas de qualidade e rotinas de checagem para quantificar a estabilidade de</w:t>
-      </w:r>
-      <w:r>
-        <w:t xml:space="preserve"> </w:t>
-      </w:r>
-      <w:r>
-        <w:t xml:space="preserve">identidade ao longo do vídeo.</w:t>
+        <w:rPr>
+          <w:b/>
+          <w:bCs/>
+        </w:rPr>
+        <w:t xml:space="preserve">Anotação</w:t>
+      </w:r>
+      <w:r>
+        <w:t xml:space="preserve">: marcação manual do peixe nas imagens.</w:t>
       </w:r>
     </w:p>
     <w:p>
@@ -1958,23 +2038,63 @@
         </w:numPr>
       </w:pPr>
       <w:r>
-        <w:t xml:space="preserve">Testes controlados com vídeos em condições progressivamente mais difíceis (densidade de</w:t>
-      </w:r>
-      <w:r>
-        <w:t xml:space="preserve"> </w:t>
-      </w:r>
-      <w:r>
-        <w:t xml:space="preserve">animais, iluminação, reflexos, ruído, variações de aparato).</w:t>
-      </w:r>
-    </w:p>
-    <w:bookmarkEnd w:id="17"/>
-    <w:bookmarkStart w:id="18" w:name="X7c2586f033fefa2c8ecf066a3bf7a1e1b90fa46"/>
+        <w:rPr>
+          <w:b/>
+          <w:bCs/>
+        </w:rPr>
+        <w:t xml:space="preserve">Detecção/segmentação</w:t>
+      </w:r>
+      <w:r>
+        <w:t xml:space="preserve">: “caixa” vs “contorno/máscara”.</w:t>
+      </w:r>
+    </w:p>
+    <w:p>
+      <w:pPr>
+        <w:pStyle w:val="Compact"/>
+        <w:numPr>
+          <w:ilvl w:val="0"/>
+          <w:numId w:val="1010"/>
+        </w:numPr>
+      </w:pPr>
+      <w:r>
+        <w:rPr>
+          <w:b/>
+          <w:bCs/>
+        </w:rPr>
+        <w:t xml:space="preserve">Confiança</w:t>
+      </w:r>
+      <w:r>
+        <w:t xml:space="preserve">: o quão seguro o modelo está.</w:t>
+      </w:r>
+    </w:p>
+    <w:p>
+      <w:pPr>
+        <w:pStyle w:val="Compact"/>
+        <w:numPr>
+          <w:ilvl w:val="0"/>
+          <w:numId w:val="1010"/>
+        </w:numPr>
+      </w:pPr>
+      <w:r>
+        <w:rPr>
+          <w:b/>
+          <w:bCs/>
+        </w:rPr>
+        <w:t xml:space="preserve">Parâmetro</w:t>
+      </w:r>
+      <w:r>
+        <w:t xml:space="preserve">: ajuste que muda sensibilidade/robustez.</w:t>
+      </w:r>
+    </w:p>
+    <w:bookmarkEnd w:id="18"/>
+    <w:bookmarkEnd w:id="19"/>
+    <w:bookmarkStart w:id="20" w:name="Xce8a6a517cf8917971ee3eabba86a6244db9818"/>
     <w:p>
       <w:pPr>
         <w:pStyle w:val="Heading3"/>
       </w:pPr>
       <w:r>
-        <w:t xml:space="preserve">3.3 Estudos de interação social e comportamento gregário (métricas e validação)</w:t>
+        <w:t xml:space="preserve">3.2 Identificação individual dos animais (rastreamento longitudinal e persistência de identidade)</w:t>
       </w:r>
     </w:p>
     <w:p>
@@ -1982,21 +2102,29 @@
         <w:pStyle w:val="FirstParagraph"/>
       </w:pPr>
       <w:r>
-        <w:t xml:space="preserve">Com a identificação individual e rastreio robusto, será possível ampliar o software para análises</w:t>
-      </w:r>
-      <w:r>
-        <w:t xml:space="preserve"> </w:t>
-      </w:r>
-      <w:r>
-        <w:t xml:space="preserve">etológicas de maior relevância, com foco em comportamento gregário e interação social.</w:t>
-      </w:r>
-    </w:p>
-    <w:p>
-      <w:pPr>
-        <w:pStyle w:val="BodyText"/>
-      </w:pPr>
-      <w:r>
-        <w:t xml:space="preserve">O plano contempla:</w:t>
+        <w:t xml:space="preserve">Para ampliar a capacidade científica do ZebTrack-AI, será desenvolvida uma camada que permita</w:t>
+      </w:r>
+      <w:r>
+        <w:t xml:space="preserve"> </w:t>
+      </w:r>
+      <w:r>
+        <w:t xml:space="preserve">associar uma</w:t>
+      </w:r>
+      <w:r>
+        <w:t xml:space="preserve"> </w:t>
+      </w:r>
+      <w:r>
+        <w:rPr>
+          <w:b/>
+          <w:bCs/>
+        </w:rPr>
+        <w:t xml:space="preserve">identidade persistente</w:t>
+      </w:r>
+      <w:r>
+        <w:t xml:space="preserve"> </w:t>
+      </w:r>
+      <w:r>
+        <w:t xml:space="preserve">aos animais ao longo do tempo, essencial para:</w:t>
       </w:r>
     </w:p>
     <w:p>
@@ -2008,19 +2136,7 @@
         </w:numPr>
       </w:pPr>
       <w:r>
-        <w:t xml:space="preserve">Definição e implementação de métricas sociais clássicas e aplicáveis ao aparato do laboratório</w:t>
-      </w:r>
-      <w:r>
-        <w:t xml:space="preserve"> </w:t>
-      </w:r>
-      <w:r>
-        <w:t xml:space="preserve">(distâncias interindividuais, coesão, vizinhança, aproximação/afastamento, sincronização de</w:t>
-      </w:r>
-      <w:r>
-        <w:t xml:space="preserve"> </w:t>
-      </w:r>
-      <w:r>
-        <w:t xml:space="preserve">movimento, liderança/seguimento e padrões de agrupamento).</w:t>
+        <w:t xml:space="preserve">Estudos longitudinais indivíduo-a-indivíduo.</w:t>
       </w:r>
     </w:p>
     <w:p>
@@ -2032,13 +2148,7 @@
         </w:numPr>
       </w:pPr>
       <w:r>
-        <w:t xml:space="preserve">Construção de saídas padronizadas para análise estatística longitudinal (R), mantendo</w:t>
-      </w:r>
-      <w:r>
-        <w:t xml:space="preserve"> </w:t>
-      </w:r>
-      <w:r>
-        <w:t xml:space="preserve">compatibilidade com estudos anteriores.</w:t>
+        <w:t xml:space="preserve">Redução de ambiguidades em cruzamentos, oclusões e aproximações.</w:t>
       </w:r>
     </w:p>
     <w:p>
@@ -2050,23 +2160,13 @@
         </w:numPr>
       </w:pPr>
       <w:r>
-        <w:t xml:space="preserve">Validação com experimentos de referência do grupo e comparação com análises manuais ou</w:t>
-      </w:r>
-      <w:r>
-        <w:t xml:space="preserve"> </w:t>
-      </w:r>
-      <w:r>
-        <w:t xml:space="preserve">semiautomáticas quando necessário.</w:t>
-      </w:r>
-    </w:p>
-    <w:bookmarkEnd w:id="18"/>
-    <w:bookmarkStart w:id="19" w:name="X58d2471900499094ab62dfb03b0a907320d8030"/>
-    <w:p>
-      <w:pPr>
-        <w:pStyle w:val="Heading3"/>
-      </w:pPr>
-      <w:r>
-        <w:t xml:space="preserve">3.4 Módulo de análise em período noturno (baixa luminosidade) e novos etogramas</w:t>
+        <w:t xml:space="preserve">Extração de métricas individuais confiáveis (velocidade, freezing, padrões espaciais,</w:t>
+      </w:r>
+      <w:r>
+        <w:t xml:space="preserve"> </w:t>
+      </w:r>
+      <w:r>
+        <w:t xml:space="preserve">preferências, latências, etc.).</w:t>
       </w:r>
     </w:p>
     <w:p>
@@ -2074,13 +2174,7 @@
         <w:pStyle w:val="FirstParagraph"/>
       </w:pPr>
       <w:r>
-        <w:t xml:space="preserve">O período noturno representa uma janela de comportamento relevante e, frequentemente, pouco</w:t>
-      </w:r>
-      <w:r>
-        <w:t xml:space="preserve"> </w:t>
-      </w:r>
-      <w:r>
-        <w:t xml:space="preserve">explorada por limitações metodológicas. A prorrogação viabiliza:</w:t>
+        <w:t xml:space="preserve">Estratégia de implementação e validação (em alto nível, sem restringir a uma única abordagem):</w:t>
       </w:r>
     </w:p>
     <w:p>
@@ -2092,23 +2186,7 @@
         </w:numPr>
       </w:pPr>
       <w:r>
-        <w:t xml:space="preserve">Desenvolvimento de um modo de aquisição e/ou processamento para</w:t>
-      </w:r>
-      <w:r>
-        <w:t xml:space="preserve"> </w:t>
-      </w:r>
-      <w:r>
-        <w:rPr>
-          <w:b/>
-          <w:bCs/>
-        </w:rPr>
-        <w:t xml:space="preserve">baixa luminosidade</w:t>
-      </w:r>
-      <w:r>
-        <w:t xml:space="preserve"> </w:t>
-      </w:r>
-      <w:r>
-        <w:t xml:space="preserve">(incluindo ajustes do pipeline e testes de robustez).</w:t>
+        <w:t xml:space="preserve">Melhorias no rastreio multiobjeto (consistência temporal e tratamento de oclusões).</w:t>
       </w:r>
     </w:p>
     <w:p>
@@ -2120,13 +2198,7 @@
         </w:numPr>
       </w:pPr>
       <w:r>
-        <w:t xml:space="preserve">Definição de rotinas para avaliar alterações comportamentais noturnas (atividade, repouso,</w:t>
-      </w:r>
-      <w:r>
-        <w:t xml:space="preserve"> </w:t>
-      </w:r>
-      <w:r>
-        <w:t xml:space="preserve">exploração, padrões espaciais e possíveis mudanças de interação social).</w:t>
+        <w:t xml:space="preserve">Uso de descritores visuais/temporais (quando aplicável) para reduzir trocas de identidade.</w:t>
       </w:r>
     </w:p>
     <w:p>
@@ -2138,7 +2210,41 @@
         </w:numPr>
       </w:pPr>
       <w:r>
-        <w:t xml:space="preserve">Ampliação do etograma digital com eventos associados ao contexto noturno.</w:t>
+        <w:t xml:space="preserve">Geração de métricas de qualidade e rotinas de checagem para quantificar a estabilidade de</w:t>
+      </w:r>
+      <w:r>
+        <w:t xml:space="preserve"> </w:t>
+      </w:r>
+      <w:r>
+        <w:t xml:space="preserve">identidade ao longo do vídeo.</w:t>
+      </w:r>
+    </w:p>
+    <w:p>
+      <w:pPr>
+        <w:pStyle w:val="Compact"/>
+        <w:numPr>
+          <w:ilvl w:val="0"/>
+          <w:numId w:val="1012"/>
+        </w:numPr>
+      </w:pPr>
+      <w:r>
+        <w:t xml:space="preserve">Testes controlados com vídeos em condições progressivamente mais difíceis (densidade de</w:t>
+      </w:r>
+      <w:r>
+        <w:t xml:space="preserve"> </w:t>
+      </w:r>
+      <w:r>
+        <w:t xml:space="preserve">animais, iluminação, reflexos, ruído, variações de aparato).</w:t>
+      </w:r>
+    </w:p>
+    <w:bookmarkEnd w:id="20"/>
+    <w:bookmarkStart w:id="21" w:name="X7c2586f033fefa2c8ecf066a3bf7a1e1b90fa46"/>
+    <w:p>
+      <w:pPr>
+        <w:pStyle w:val="Heading3"/>
+      </w:pPr>
+      <w:r>
+        <w:t xml:space="preserve">3.3 Estudos de interação social e comportamento gregário (métricas e validação)</w:t>
       </w:r>
     </w:p>
     <w:p>
@@ -2146,37 +2252,21 @@
         <w:pStyle w:val="FirstParagraph"/>
       </w:pPr>
       <w:r>
-        <w:t xml:space="preserve">Essa frente é diretamente alinhada ao objetivo de “levar o estudo etológico de zebrafish a outro</w:t>
-      </w:r>
-      <w:r>
-        <w:t xml:space="preserve"> </w:t>
-      </w:r>
-      <w:r>
-        <w:t xml:space="preserve">nível de excelência, automação e eficácia”, com evidências quantitativas e reprodutíveis.</w:t>
-      </w:r>
-    </w:p>
-    <w:bookmarkEnd w:id="19"/>
-    <w:bookmarkStart w:id="20" w:name="X09e6cc56acdc9bf8bb9b4f7bffa9e1ce2d36282"/>
-    <w:p>
-      <w:pPr>
-        <w:pStyle w:val="Heading3"/>
-      </w:pPr>
-      <w:r>
-        <w:t xml:space="preserve">3.5 Validação colaborativa com pesquisadores do grupo e replicabilidade</w:t>
-      </w:r>
-    </w:p>
-    <w:p>
-      <w:pPr>
-        <w:pStyle w:val="FirstParagraph"/>
-      </w:pPr>
-      <w:r>
-        <w:t xml:space="preserve">As novas funções propostas surgiram ao longo do desenvolvimento do software e serão</w:t>
-      </w:r>
-      <w:r>
-        <w:t xml:space="preserve"> </w:t>
-      </w:r>
-      <w:r>
-        <w:t xml:space="preserve">consolidadas com uma etapa dedicada de validação colaborativa:</w:t>
+        <w:t xml:space="preserve">Com a identificação individual e rastreio robusto, será possível ampliar o software para análises</w:t>
+      </w:r>
+      <w:r>
+        <w:t xml:space="preserve"> </w:t>
+      </w:r>
+      <w:r>
+        <w:t xml:space="preserve">etológicas de maior relevância, com foco em comportamento gregário e interação social.</w:t>
+      </w:r>
+    </w:p>
+    <w:p>
+      <w:pPr>
+        <w:pStyle w:val="BodyText"/>
+      </w:pPr>
+      <w:r>
+        <w:t xml:space="preserve">O plano contempla:</w:t>
       </w:r>
     </w:p>
     <w:p>
@@ -2188,13 +2278,19 @@
         </w:numPr>
       </w:pPr>
       <w:r>
-        <w:t xml:space="preserve">Sessões de testes com colegas pesquisadores do grupo, para avaliar usabilidade e robustez em</w:t>
-      </w:r>
-      <w:r>
-        <w:t xml:space="preserve"> </w:t>
-      </w:r>
-      <w:r>
-        <w:t xml:space="preserve">cenários reais (diferentes operadores e rotinas).</w:t>
+        <w:t xml:space="preserve">Definição e implementação de métricas sociais clássicas e aplicáveis ao aparato do laboratório</w:t>
+      </w:r>
+      <w:r>
+        <w:t xml:space="preserve"> </w:t>
+      </w:r>
+      <w:r>
+        <w:t xml:space="preserve">(distâncias interindividuais, coesão, vizinhança, aproximação/afastamento, sincronização de</w:t>
+      </w:r>
+      <w:r>
+        <w:t xml:space="preserve"> </w:t>
+      </w:r>
+      <w:r>
+        <w:t xml:space="preserve">movimento, liderança/seguimento e padrões de agrupamento).</w:t>
       </w:r>
     </w:p>
     <w:p>
@@ -2206,7 +2302,13 @@
         </w:numPr>
       </w:pPr>
       <w:r>
-        <w:t xml:space="preserve">Coleta de feedback estruturado e ajustes de interface/fluxo (sem perder reprodutibilidade).</w:t>
+        <w:t xml:space="preserve">Construção de saídas padronizadas para análise estatística longitudinal (R), mantendo</w:t>
+      </w:r>
+      <w:r>
+        <w:t xml:space="preserve"> </w:t>
+      </w:r>
+      <w:r>
+        <w:t xml:space="preserve">compatibilidade com estudos anteriores.</w:t>
       </w:r>
     </w:p>
     <w:p>
@@ -2218,6 +2320,174 @@
         </w:numPr>
       </w:pPr>
       <w:r>
+        <w:t xml:space="preserve">Validação com experimentos de referência do grupo e comparação com análises manuais ou</w:t>
+      </w:r>
+      <w:r>
+        <w:t xml:space="preserve"> </w:t>
+      </w:r>
+      <w:r>
+        <w:t xml:space="preserve">semiautomáticas quando necessário.</w:t>
+      </w:r>
+    </w:p>
+    <w:bookmarkEnd w:id="21"/>
+    <w:bookmarkStart w:id="22" w:name="X58d2471900499094ab62dfb03b0a907320d8030"/>
+    <w:p>
+      <w:pPr>
+        <w:pStyle w:val="Heading3"/>
+      </w:pPr>
+      <w:r>
+        <w:t xml:space="preserve">3.4 Módulo de análise em período noturno (baixa luminosidade) e novos etogramas</w:t>
+      </w:r>
+    </w:p>
+    <w:p>
+      <w:pPr>
+        <w:pStyle w:val="FirstParagraph"/>
+      </w:pPr>
+      <w:r>
+        <w:t xml:space="preserve">O período noturno representa uma janela de comportamento relevante e, frequentemente, pouco</w:t>
+      </w:r>
+      <w:r>
+        <w:t xml:space="preserve"> </w:t>
+      </w:r>
+      <w:r>
+        <w:t xml:space="preserve">explorada por limitações metodológicas. A prorrogação viabiliza:</w:t>
+      </w:r>
+    </w:p>
+    <w:p>
+      <w:pPr>
+        <w:pStyle w:val="Compact"/>
+        <w:numPr>
+          <w:ilvl w:val="0"/>
+          <w:numId w:val="1014"/>
+        </w:numPr>
+      </w:pPr>
+      <w:r>
+        <w:t xml:space="preserve">Desenvolvimento de um modo de aquisição e/ou processamento para</w:t>
+      </w:r>
+      <w:r>
+        <w:t xml:space="preserve"> </w:t>
+      </w:r>
+      <w:r>
+        <w:rPr>
+          <w:b/>
+          <w:bCs/>
+        </w:rPr>
+        <w:t xml:space="preserve">baixa luminosidade</w:t>
+      </w:r>
+      <w:r>
+        <w:t xml:space="preserve"> </w:t>
+      </w:r>
+      <w:r>
+        <w:t xml:space="preserve">(incluindo ajustes do pipeline e testes de robustez).</w:t>
+      </w:r>
+    </w:p>
+    <w:p>
+      <w:pPr>
+        <w:pStyle w:val="Compact"/>
+        <w:numPr>
+          <w:ilvl w:val="0"/>
+          <w:numId w:val="1014"/>
+        </w:numPr>
+      </w:pPr>
+      <w:r>
+        <w:t xml:space="preserve">Definição de rotinas para avaliar alterações comportamentais noturnas (atividade, repouso,</w:t>
+      </w:r>
+      <w:r>
+        <w:t xml:space="preserve"> </w:t>
+      </w:r>
+      <w:r>
+        <w:t xml:space="preserve">exploração, padrões espaciais e possíveis mudanças de interação social).</w:t>
+      </w:r>
+    </w:p>
+    <w:p>
+      <w:pPr>
+        <w:pStyle w:val="Compact"/>
+        <w:numPr>
+          <w:ilvl w:val="0"/>
+          <w:numId w:val="1014"/>
+        </w:numPr>
+      </w:pPr>
+      <w:r>
+        <w:t xml:space="preserve">Ampliação do etograma digital com eventos associados ao contexto noturno.</w:t>
+      </w:r>
+    </w:p>
+    <w:p>
+      <w:pPr>
+        <w:pStyle w:val="FirstParagraph"/>
+      </w:pPr>
+      <w:r>
+        <w:t xml:space="preserve">Essa frente é diretamente alinhada ao objetivo de “levar o estudo etológico de zebrafish a outro</w:t>
+      </w:r>
+      <w:r>
+        <w:t xml:space="preserve"> </w:t>
+      </w:r>
+      <w:r>
+        <w:t xml:space="preserve">nível de excelência, automação e eficácia”, com evidências quantitativas e reprodutíveis.</w:t>
+      </w:r>
+    </w:p>
+    <w:bookmarkEnd w:id="22"/>
+    <w:bookmarkStart w:id="23" w:name="X09e6cc56acdc9bf8bb9b4f7bffa9e1ce2d36282"/>
+    <w:p>
+      <w:pPr>
+        <w:pStyle w:val="Heading3"/>
+      </w:pPr>
+      <w:r>
+        <w:t xml:space="preserve">3.5 Validação colaborativa com pesquisadores do grupo e replicabilidade</w:t>
+      </w:r>
+    </w:p>
+    <w:p>
+      <w:pPr>
+        <w:pStyle w:val="FirstParagraph"/>
+      </w:pPr>
+      <w:r>
+        <w:t xml:space="preserve">As novas funções propostas surgiram ao longo do desenvolvimento do software e serão</w:t>
+      </w:r>
+      <w:r>
+        <w:t xml:space="preserve"> </w:t>
+      </w:r>
+      <w:r>
+        <w:t xml:space="preserve">consolidadas com uma etapa dedicada de validação colaborativa:</w:t>
+      </w:r>
+    </w:p>
+    <w:p>
+      <w:pPr>
+        <w:pStyle w:val="Compact"/>
+        <w:numPr>
+          <w:ilvl w:val="0"/>
+          <w:numId w:val="1015"/>
+        </w:numPr>
+      </w:pPr>
+      <w:r>
+        <w:t xml:space="preserve">Sessões de testes com colegas pesquisadores do grupo, para avaliar usabilidade e robustez em</w:t>
+      </w:r>
+      <w:r>
+        <w:t xml:space="preserve"> </w:t>
+      </w:r>
+      <w:r>
+        <w:t xml:space="preserve">cenários reais (diferentes operadores e rotinas).</w:t>
+      </w:r>
+    </w:p>
+    <w:p>
+      <w:pPr>
+        <w:pStyle w:val="Compact"/>
+        <w:numPr>
+          <w:ilvl w:val="0"/>
+          <w:numId w:val="1015"/>
+        </w:numPr>
+      </w:pPr>
+      <w:r>
+        <w:t xml:space="preserve">Coleta de feedback estruturado e ajustes de interface/fluxo (sem perder reprodutibilidade).</w:t>
+      </w:r>
+    </w:p>
+    <w:p>
+      <w:pPr>
+        <w:pStyle w:val="Compact"/>
+        <w:numPr>
+          <w:ilvl w:val="0"/>
+          <w:numId w:val="1015"/>
+        </w:numPr>
+      </w:pPr>
+      <w:r>
         <w:t xml:space="preserve">Validação de consistência dos resultados e comparação entre execuções.</w:t>
       </w:r>
     </w:p>
@@ -2278,9 +2548,9 @@
         </w:pict>
       </w:r>
     </w:p>
-    <w:bookmarkEnd w:id="20"/>
-    <w:bookmarkEnd w:id="21"/>
-    <w:bookmarkStart w:id="22" w:name="cronograma-de-execução-12-meses"/>
+    <w:bookmarkEnd w:id="23"/>
+    <w:bookmarkEnd w:id="24"/>
+    <w:bookmarkStart w:id="25" w:name="cronograma-de-execução-12-meses"/>
     <w:p>
       <w:pPr>
         <w:pStyle w:val="Heading2"/>
@@ -3335,8 +3605,8 @@
         </w:pict>
       </w:r>
     </w:p>
-    <w:bookmarkEnd w:id="22"/>
-    <w:bookmarkStart w:id="25" w:name="bibliografia"/>
+    <w:bookmarkEnd w:id="25"/>
+    <w:bookmarkStart w:id="28" w:name="bibliografia"/>
     <w:p>
       <w:pPr>
         <w:pStyle w:val="Heading2"/>
@@ -3539,7 +3809,7 @@
       <w:r>
         <w:t xml:space="preserve"> </w:t>
       </w:r>
-      <w:hyperlink r:id="rId23">
+      <w:hyperlink r:id="rId26">
         <w:r>
           <w:rPr>
             <w:rStyle w:val="Hyperlink"/>
@@ -3608,7 +3878,7 @@
       <w:r>
         <w:t xml:space="preserve"> </w:t>
       </w:r>
-      <w:hyperlink r:id="rId24">
+      <w:hyperlink r:id="rId27">
         <w:r>
           <w:rPr>
             <w:rStyle w:val="Hyperlink"/>
@@ -3708,8 +3978,8 @@
         <w:t xml:space="preserve">, v. 2023, 2023.</w:t>
       </w:r>
     </w:p>
-    <w:bookmarkEnd w:id="25"/>
-    <w:bookmarkEnd w:id="26"/>
+    <w:bookmarkEnd w:id="28"/>
+    <w:bookmarkEnd w:id="29"/>
     <w:sectPr>
       <w:footnotePr>
         <w:numRestart w:val="eachSect"/>
@@ -4214,6 +4484,12 @@
     <w:abstractNumId w:val="991"/>
   </w:num>
   <w:num w:numId="1013">
+    <w:abstractNumId w:val="991"/>
+  </w:num>
+  <w:num w:numId="1014">
+    <w:abstractNumId w:val="991"/>
+  </w:num>
+  <w:num w:numId="1015">
     <w:abstractNumId w:val="991"/>
   </w:num>
 </w:numbering>

</xml_diff>